<commit_message>
Records: AI outage fix, journal, change log, playbook
Co-Authored-By: Claude Opus 5.5 <noreply@anthropic.com>
Claude-Session: https://claude.ai/code/session_01JPZJaTbXQFN2qiYRf4rkZK
</commit_message>
<xml_diff>
--- a/docs/Next_Owner_Market_App_Builder_Playbook.docx
+++ b/docs/Next_Owner_Market_App_Builder_Playbook.docx
@@ -41661,6 +41661,2205 @@
           <w:rStyle w:val="OperatorTok"/>
         </w:rPr>
         <w:t xml:space="preserve">;</w:t>
+      </w:r>
+      <w:r>
+        <w:br/>
+      </w:r>
+      <w:r>
+        <w:rPr>
+          <w:rStyle w:val="NormalTok"/>
+        </w:rPr>
+        <w:t xml:space="preserve">}</w:t>
+      </w:r>
+      <w:r>
+        <w:br/>
+      </w:r>
+      <w:r>
+        <w:br/>
+      </w:r>
+      <w:r>
+        <w:rPr>
+          <w:rStyle w:val="CommentTok"/>
+        </w:rPr>
+        <w:t xml:space="preserve">/**</w:t>
+      </w:r>
+      <w:r>
+        <w:br/>
+      </w:r>
+      <w:r>
+        <w:rPr>
+          <w:rStyle w:val="CommentTok"/>
+        </w:rPr>
+        <w:t xml:space="preserve"> * Oct 9, 2026: the AI account ran out of prepaid credit and every tool told customers "try a clearer photo."</w:t>
+      </w:r>
+      <w:r>
+        <w:br/>
+      </w:r>
+      <w:r>
+        <w:rPr>
+          <w:rStyle w:val="CommentTok"/>
+        </w:rPr>
+        <w:t xml:space="preserve"> * These tell an outage apart from a bad photo: out of credit, bad key, rate limit, overloaded or server errors.</w:t>
+      </w:r>
+      <w:r>
+        <w:br/>
+      </w:r>
+      <w:r>
+        <w:rPr>
+          <w:rStyle w:val="CommentTok"/>
+        </w:rPr>
+        <w:t xml:space="preserve"> */</w:t>
+      </w:r>
+      <w:r>
+        <w:br/>
+      </w:r>
+      <w:r>
+        <w:rPr>
+          <w:rStyle w:val="ImportTok"/>
+        </w:rPr>
+        <w:t xml:space="preserve">export</w:t>
+      </w:r>
+      <w:r>
+        <w:rPr>
+          <w:rStyle w:val="NormalTok"/>
+        </w:rPr>
+        <w:t xml:space="preserve"> </w:t>
+      </w:r>
+      <w:r>
+        <w:rPr>
+          <w:rStyle w:val="KeywordTok"/>
+        </w:rPr>
+        <w:t xml:space="preserve">function</w:t>
+      </w:r>
+      <w:r>
+        <w:rPr>
+          <w:rStyle w:val="NormalTok"/>
+        </w:rPr>
+        <w:t xml:space="preserve"> </w:t>
+      </w:r>
+      <w:r>
+        <w:rPr>
+          <w:rStyle w:val="FunctionTok"/>
+        </w:rPr>
+        <w:t xml:space="preserve">aiServiceDown</w:t>
+      </w:r>
+      <w:r>
+        <w:rPr>
+          <w:rStyle w:val="NormalTok"/>
+        </w:rPr>
+        <w:t xml:space="preserve">(e</w:t>
+      </w:r>
+      <w:r>
+        <w:rPr>
+          <w:rStyle w:val="OperatorTok"/>
+        </w:rPr>
+        <w:t xml:space="preserve">:</w:t>
+      </w:r>
+      <w:r>
+        <w:rPr>
+          <w:rStyle w:val="NormalTok"/>
+        </w:rPr>
+        <w:t xml:space="preserve"> </w:t>
+      </w:r>
+      <w:r>
+        <w:rPr>
+          <w:rStyle w:val="DataTypeTok"/>
+        </w:rPr>
+        <w:t xml:space="preserve">unknown</w:t>
+      </w:r>
+      <w:r>
+        <w:rPr>
+          <w:rStyle w:val="NormalTok"/>
+        </w:rPr>
+        <w:t xml:space="preserve">)</w:t>
+      </w:r>
+      <w:r>
+        <w:rPr>
+          <w:rStyle w:val="OperatorTok"/>
+        </w:rPr>
+        <w:t xml:space="preserve">:</w:t>
+      </w:r>
+      <w:r>
+        <w:rPr>
+          <w:rStyle w:val="NormalTok"/>
+        </w:rPr>
+        <w:t xml:space="preserve"> </w:t>
+      </w:r>
+      <w:r>
+        <w:rPr>
+          <w:rStyle w:val="DataTypeTok"/>
+        </w:rPr>
+        <w:t xml:space="preserve">boolean</w:t>
+      </w:r>
+      <w:r>
+        <w:rPr>
+          <w:rStyle w:val="NormalTok"/>
+        </w:rPr>
+        <w:t xml:space="preserve"> {</w:t>
+      </w:r>
+      <w:r>
+        <w:br/>
+      </w:r>
+      <w:r>
+        <w:rPr>
+          <w:rStyle w:val="NormalTok"/>
+        </w:rPr>
+        <w:t xml:space="preserve">  </w:t>
+      </w:r>
+      <w:r>
+        <w:rPr>
+          <w:rStyle w:val="KeywordTok"/>
+        </w:rPr>
+        <w:t xml:space="preserve">const</w:t>
+      </w:r>
+      <w:r>
+        <w:rPr>
+          <w:rStyle w:val="NormalTok"/>
+        </w:rPr>
+        <w:t xml:space="preserve"> status </w:t>
+      </w:r>
+      <w:r>
+        <w:rPr>
+          <w:rStyle w:val="OperatorTok"/>
+        </w:rPr>
+        <w:t xml:space="preserve">=</w:t>
+      </w:r>
+      <w:r>
+        <w:rPr>
+          <w:rStyle w:val="NormalTok"/>
+        </w:rPr>
+        <w:t xml:space="preserve"> </w:t>
+      </w:r>
+      <w:r>
+        <w:rPr>
+          <w:rStyle w:val="BuiltInTok"/>
+        </w:rPr>
+        <w:t xml:space="preserve">Number</w:t>
+      </w:r>
+      <w:r>
+        <w:rPr>
+          <w:rStyle w:val="NormalTok"/>
+        </w:rPr>
+        <w:t xml:space="preserve">((e </w:t>
+      </w:r>
+      <w:r>
+        <w:rPr>
+          <w:rStyle w:val="ImportTok"/>
+        </w:rPr>
+        <w:t xml:space="preserve">as</w:t>
+      </w:r>
+      <w:r>
+        <w:rPr>
+          <w:rStyle w:val="NormalTok"/>
+        </w:rPr>
+        <w:t xml:space="preserve"> { status</w:t>
+      </w:r>
+      <w:r>
+        <w:rPr>
+          <w:rStyle w:val="OperatorTok"/>
+        </w:rPr>
+        <w:t xml:space="preserve">?:</w:t>
+      </w:r>
+      <w:r>
+        <w:rPr>
+          <w:rStyle w:val="NormalTok"/>
+        </w:rPr>
+        <w:t xml:space="preserve"> </w:t>
+      </w:r>
+      <w:r>
+        <w:rPr>
+          <w:rStyle w:val="DataTypeTok"/>
+        </w:rPr>
+        <w:t xml:space="preserve">number</w:t>
+      </w:r>
+      <w:r>
+        <w:rPr>
+          <w:rStyle w:val="NormalTok"/>
+        </w:rPr>
+        <w:t xml:space="preserve"> } </w:t>
+      </w:r>
+      <w:r>
+        <w:rPr>
+          <w:rStyle w:val="OperatorTok"/>
+        </w:rPr>
+        <w:t xml:space="preserve">|</w:t>
+      </w:r>
+      <w:r>
+        <w:rPr>
+          <w:rStyle w:val="NormalTok"/>
+        </w:rPr>
+        <w:t xml:space="preserve"> </w:t>
+      </w:r>
+      <w:r>
+        <w:rPr>
+          <w:rStyle w:val="DataTypeTok"/>
+        </w:rPr>
+        <w:t xml:space="preserve">null</w:t>
+      </w:r>
+      <w:r>
+        <w:rPr>
+          <w:rStyle w:val="NormalTok"/>
+        </w:rPr>
+        <w:t xml:space="preserve">)</w:t>
+      </w:r>
+      <w:r>
+        <w:rPr>
+          <w:rStyle w:val="OperatorTok"/>
+        </w:rPr>
+        <w:t xml:space="preserve">?.</w:t>
+      </w:r>
+      <w:r>
+        <w:rPr>
+          <w:rStyle w:val="AttributeTok"/>
+        </w:rPr>
+        <w:t xml:space="preserve">status</w:t>
+      </w:r>
+      <w:r>
+        <w:rPr>
+          <w:rStyle w:val="NormalTok"/>
+        </w:rPr>
+        <w:t xml:space="preserve"> </w:t>
+      </w:r>
+      <w:r>
+        <w:rPr>
+          <w:rStyle w:val="OperatorTok"/>
+        </w:rPr>
+        <w:t xml:space="preserve">||</w:t>
+      </w:r>
+      <w:r>
+        <w:rPr>
+          <w:rStyle w:val="NormalTok"/>
+        </w:rPr>
+        <w:t xml:space="preserve"> </w:t>
+      </w:r>
+      <w:r>
+        <w:rPr>
+          <w:rStyle w:val="DecValTok"/>
+        </w:rPr>
+        <w:t xml:space="preserve">0</w:t>
+      </w:r>
+      <w:r>
+        <w:rPr>
+          <w:rStyle w:val="NormalTok"/>
+        </w:rPr>
+        <w:t xml:space="preserve">)</w:t>
+      </w:r>
+      <w:r>
+        <w:rPr>
+          <w:rStyle w:val="OperatorTok"/>
+        </w:rPr>
+        <w:t xml:space="preserve">;</w:t>
+      </w:r>
+      <w:r>
+        <w:br/>
+      </w:r>
+      <w:r>
+        <w:rPr>
+          <w:rStyle w:val="NormalTok"/>
+        </w:rPr>
+        <w:t xml:space="preserve">  </w:t>
+      </w:r>
+      <w:r>
+        <w:rPr>
+          <w:rStyle w:val="KeywordTok"/>
+        </w:rPr>
+        <w:t xml:space="preserve">const</w:t>
+      </w:r>
+      <w:r>
+        <w:rPr>
+          <w:rStyle w:val="NormalTok"/>
+        </w:rPr>
+        <w:t xml:space="preserve"> msg </w:t>
+      </w:r>
+      <w:r>
+        <w:rPr>
+          <w:rStyle w:val="OperatorTok"/>
+        </w:rPr>
+        <w:t xml:space="preserve">=</w:t>
+      </w:r>
+      <w:r>
+        <w:rPr>
+          <w:rStyle w:val="NormalTok"/>
+        </w:rPr>
+        <w:t xml:space="preserve"> e </w:t>
+      </w:r>
+      <w:r>
+        <w:rPr>
+          <w:rStyle w:val="KeywordTok"/>
+        </w:rPr>
+        <w:t xml:space="preserve">instanceof</w:t>
+      </w:r>
+      <w:r>
+        <w:rPr>
+          <w:rStyle w:val="NormalTok"/>
+        </w:rPr>
+        <w:t xml:space="preserve"> </w:t>
+      </w:r>
+      <w:r>
+        <w:rPr>
+          <w:rStyle w:val="BuiltInTok"/>
+        </w:rPr>
+        <w:t xml:space="preserve">Error</w:t>
+      </w:r>
+      <w:r>
+        <w:rPr>
+          <w:rStyle w:val="NormalTok"/>
+        </w:rPr>
+        <w:t xml:space="preserve"> </w:t>
+      </w:r>
+      <w:r>
+        <w:rPr>
+          <w:rStyle w:val="OperatorTok"/>
+        </w:rPr>
+        <w:t xml:space="preserve">?</w:t>
+      </w:r>
+      <w:r>
+        <w:rPr>
+          <w:rStyle w:val="NormalTok"/>
+        </w:rPr>
+        <w:t xml:space="preserve"> e</w:t>
+      </w:r>
+      <w:r>
+        <w:rPr>
+          <w:rStyle w:val="OperatorTok"/>
+        </w:rPr>
+        <w:t xml:space="preserve">.</w:t>
+      </w:r>
+      <w:r>
+        <w:rPr>
+          <w:rStyle w:val="AttributeTok"/>
+        </w:rPr>
+        <w:t xml:space="preserve">message</w:t>
+      </w:r>
+      <w:r>
+        <w:rPr>
+          <w:rStyle w:val="NormalTok"/>
+        </w:rPr>
+        <w:t xml:space="preserve"> </w:t>
+      </w:r>
+      <w:r>
+        <w:rPr>
+          <w:rStyle w:val="OperatorTok"/>
+        </w:rPr>
+        <w:t xml:space="preserve">:</w:t>
+      </w:r>
+      <w:r>
+        <w:rPr>
+          <w:rStyle w:val="NormalTok"/>
+        </w:rPr>
+        <w:t xml:space="preserve"> </w:t>
+      </w:r>
+      <w:r>
+        <w:rPr>
+          <w:rStyle w:val="BuiltInTok"/>
+        </w:rPr>
+        <w:t xml:space="preserve">String</w:t>
+      </w:r>
+      <w:r>
+        <w:rPr>
+          <w:rStyle w:val="NormalTok"/>
+        </w:rPr>
+        <w:t xml:space="preserve">(e)</w:t>
+      </w:r>
+      <w:r>
+        <w:rPr>
+          <w:rStyle w:val="OperatorTok"/>
+        </w:rPr>
+        <w:t xml:space="preserve">;</w:t>
+      </w:r>
+      <w:r>
+        <w:br/>
+      </w:r>
+      <w:r>
+        <w:rPr>
+          <w:rStyle w:val="NormalTok"/>
+        </w:rPr>
+        <w:t xml:space="preserve">  </w:t>
+      </w:r>
+      <w:r>
+        <w:rPr>
+          <w:rStyle w:val="ControlFlowTok"/>
+        </w:rPr>
+        <w:t xml:space="preserve">return</w:t>
+      </w:r>
+      <w:r>
+        <w:rPr>
+          <w:rStyle w:val="NormalTok"/>
+        </w:rPr>
+        <w:t xml:space="preserve"> status </w:t>
+      </w:r>
+      <w:r>
+        <w:rPr>
+          <w:rStyle w:val="OperatorTok"/>
+        </w:rPr>
+        <w:t xml:space="preserve">===</w:t>
+      </w:r>
+      <w:r>
+        <w:rPr>
+          <w:rStyle w:val="NormalTok"/>
+        </w:rPr>
+        <w:t xml:space="preserve"> </w:t>
+      </w:r>
+      <w:r>
+        <w:rPr>
+          <w:rStyle w:val="DecValTok"/>
+        </w:rPr>
+        <w:t xml:space="preserve">401</w:t>
+      </w:r>
+      <w:r>
+        <w:rPr>
+          <w:rStyle w:val="NormalTok"/>
+        </w:rPr>
+        <w:t xml:space="preserve"> </w:t>
+      </w:r>
+      <w:r>
+        <w:rPr>
+          <w:rStyle w:val="OperatorTok"/>
+        </w:rPr>
+        <w:t xml:space="preserve">||</w:t>
+      </w:r>
+      <w:r>
+        <w:rPr>
+          <w:rStyle w:val="NormalTok"/>
+        </w:rPr>
+        <w:t xml:space="preserve"> status </w:t>
+      </w:r>
+      <w:r>
+        <w:rPr>
+          <w:rStyle w:val="OperatorTok"/>
+        </w:rPr>
+        <w:t xml:space="preserve">===</w:t>
+      </w:r>
+      <w:r>
+        <w:rPr>
+          <w:rStyle w:val="NormalTok"/>
+        </w:rPr>
+        <w:t xml:space="preserve"> </w:t>
+      </w:r>
+      <w:r>
+        <w:rPr>
+          <w:rStyle w:val="DecValTok"/>
+        </w:rPr>
+        <w:t xml:space="preserve">403</w:t>
+      </w:r>
+      <w:r>
+        <w:rPr>
+          <w:rStyle w:val="NormalTok"/>
+        </w:rPr>
+        <w:t xml:space="preserve"> </w:t>
+      </w:r>
+      <w:r>
+        <w:rPr>
+          <w:rStyle w:val="OperatorTok"/>
+        </w:rPr>
+        <w:t xml:space="preserve">||</w:t>
+      </w:r>
+      <w:r>
+        <w:rPr>
+          <w:rStyle w:val="NormalTok"/>
+        </w:rPr>
+        <w:t xml:space="preserve"> status </w:t>
+      </w:r>
+      <w:r>
+        <w:rPr>
+          <w:rStyle w:val="OperatorTok"/>
+        </w:rPr>
+        <w:t xml:space="preserve">===</w:t>
+      </w:r>
+      <w:r>
+        <w:rPr>
+          <w:rStyle w:val="NormalTok"/>
+        </w:rPr>
+        <w:t xml:space="preserve"> </w:t>
+      </w:r>
+      <w:r>
+        <w:rPr>
+          <w:rStyle w:val="DecValTok"/>
+        </w:rPr>
+        <w:t xml:space="preserve">429</w:t>
+      </w:r>
+      <w:r>
+        <w:rPr>
+          <w:rStyle w:val="NormalTok"/>
+        </w:rPr>
+        <w:t xml:space="preserve"> </w:t>
+      </w:r>
+      <w:r>
+        <w:rPr>
+          <w:rStyle w:val="OperatorTok"/>
+        </w:rPr>
+        <w:t xml:space="preserve">||</w:t>
+      </w:r>
+      <w:r>
+        <w:rPr>
+          <w:rStyle w:val="NormalTok"/>
+        </w:rPr>
+        <w:t xml:space="preserve"> status </w:t>
+      </w:r>
+      <w:r>
+        <w:rPr>
+          <w:rStyle w:val="OperatorTok"/>
+        </w:rPr>
+        <w:t xml:space="preserve">&gt;=</w:t>
+      </w:r>
+      <w:r>
+        <w:rPr>
+          <w:rStyle w:val="NormalTok"/>
+        </w:rPr>
+        <w:t xml:space="preserve"> </w:t>
+      </w:r>
+      <w:r>
+        <w:rPr>
+          <w:rStyle w:val="DecValTok"/>
+        </w:rPr>
+        <w:t xml:space="preserve">500</w:t>
+      </w:r>
+      <w:r>
+        <w:rPr>
+          <w:rStyle w:val="NormalTok"/>
+        </w:rPr>
+        <w:t xml:space="preserve"> </w:t>
+      </w:r>
+      <w:r>
+        <w:rPr>
+          <w:rStyle w:val="OperatorTok"/>
+        </w:rPr>
+        <w:t xml:space="preserve">||</w:t>
+      </w:r>
+      <w:r>
+        <w:rPr>
+          <w:rStyle w:val="NormalTok"/>
+        </w:rPr>
+        <w:t xml:space="preserve"> </w:t>
+      </w:r>
+      <w:r>
+        <w:rPr>
+          <w:rStyle w:val="SpecialStringTok"/>
+        </w:rPr>
+        <w:t xml:space="preserve">/credit balance</w:t>
+      </w:r>
+      <w:r>
+        <w:rPr>
+          <w:rStyle w:val="SpecialCharTok"/>
+        </w:rPr>
+        <w:t xml:space="preserve">|</w:t>
+      </w:r>
+      <w:r>
+        <w:rPr>
+          <w:rStyle w:val="SpecialStringTok"/>
+        </w:rPr>
+        <w:t xml:space="preserve">billing</w:t>
+      </w:r>
+      <w:r>
+        <w:rPr>
+          <w:rStyle w:val="SpecialCharTok"/>
+        </w:rPr>
+        <w:t xml:space="preserve">|</w:t>
+      </w:r>
+      <w:r>
+        <w:rPr>
+          <w:rStyle w:val="SpecialStringTok"/>
+        </w:rPr>
+        <w:t xml:space="preserve">overloaded</w:t>
+      </w:r>
+      <w:r>
+        <w:rPr>
+          <w:rStyle w:val="SpecialCharTok"/>
+        </w:rPr>
+        <w:t xml:space="preserve">|</w:t>
+      </w:r>
+      <w:r>
+        <w:rPr>
+          <w:rStyle w:val="SpecialStringTok"/>
+        </w:rPr>
+        <w:t xml:space="preserve">rate.</w:t>
+      </w:r>
+      <w:r>
+        <w:rPr>
+          <w:rStyle w:val="SpecialCharTok"/>
+        </w:rPr>
+        <w:t xml:space="preserve">?</w:t>
+      </w:r>
+      <w:r>
+        <w:rPr>
+          <w:rStyle w:val="SpecialStringTok"/>
+        </w:rPr>
+        <w:t xml:space="preserve">limit</w:t>
+      </w:r>
+      <w:r>
+        <w:rPr>
+          <w:rStyle w:val="SpecialCharTok"/>
+        </w:rPr>
+        <w:t xml:space="preserve">|</w:t>
+      </w:r>
+      <w:r>
+        <w:rPr>
+          <w:rStyle w:val="SpecialStringTok"/>
+        </w:rPr>
+        <w:t xml:space="preserve">authentication</w:t>
+      </w:r>
+      <w:r>
+        <w:rPr>
+          <w:rStyle w:val="SpecialCharTok"/>
+        </w:rPr>
+        <w:t xml:space="preserve">|</w:t>
+      </w:r>
+      <w:r>
+        <w:rPr>
+          <w:rStyle w:val="SpecialStringTok"/>
+        </w:rPr>
+        <w:t xml:space="preserve">api key/i</w:t>
+      </w:r>
+      <w:r>
+        <w:rPr>
+          <w:rStyle w:val="OperatorTok"/>
+        </w:rPr>
+        <w:t xml:space="preserve">.</w:t>
+      </w:r>
+      <w:r>
+        <w:rPr>
+          <w:rStyle w:val="FunctionTok"/>
+        </w:rPr>
+        <w:t xml:space="preserve">test</w:t>
+      </w:r>
+      <w:r>
+        <w:rPr>
+          <w:rStyle w:val="NormalTok"/>
+        </w:rPr>
+        <w:t xml:space="preserve">(msg)</w:t>
+      </w:r>
+      <w:r>
+        <w:rPr>
+          <w:rStyle w:val="OperatorTok"/>
+        </w:rPr>
+        <w:t xml:space="preserve">;</w:t>
+      </w:r>
+      <w:r>
+        <w:br/>
+      </w:r>
+      <w:r>
+        <w:rPr>
+          <w:rStyle w:val="NormalTok"/>
+        </w:rPr>
+        <w:t xml:space="preserve">}</w:t>
+      </w:r>
+      <w:r>
+        <w:br/>
+      </w:r>
+      <w:r>
+        <w:rPr>
+          <w:rStyle w:val="ImportTok"/>
+        </w:rPr>
+        <w:t xml:space="preserve">export</w:t>
+      </w:r>
+      <w:r>
+        <w:rPr>
+          <w:rStyle w:val="NormalTok"/>
+        </w:rPr>
+        <w:t xml:space="preserve"> </w:t>
+      </w:r>
+      <w:r>
+        <w:rPr>
+          <w:rStyle w:val="KeywordTok"/>
+        </w:rPr>
+        <w:t xml:space="preserve">const</w:t>
+      </w:r>
+      <w:r>
+        <w:rPr>
+          <w:rStyle w:val="NormalTok"/>
+        </w:rPr>
+        <w:t xml:space="preserve"> AI_DOWN_MESSAGE </w:t>
+      </w:r>
+      <w:r>
+        <w:rPr>
+          <w:rStyle w:val="OperatorTok"/>
+        </w:rPr>
+        <w:t xml:space="preserve">=</w:t>
+      </w:r>
+      <w:r>
+        <w:rPr>
+          <w:rStyle w:val="NormalTok"/>
+        </w:rPr>
+        <w:t xml:space="preserve"> </w:t>
+      </w:r>
+      <w:r>
+        <w:rPr>
+          <w:rStyle w:val="StringTok"/>
+        </w:rPr>
+        <w:t xml:space="preserve">"Our AI is taking a short break right now. Nothing was used or charged. Please try again in a little while."</w:t>
+      </w:r>
+      <w:r>
+        <w:rPr>
+          <w:rStyle w:val="OperatorTok"/>
+        </w:rPr>
+        <w:t xml:space="preserve">;</w:t>
+      </w:r>
+      <w:r>
+        <w:br/>
+      </w:r>
+      <w:r>
+        <w:br/>
+      </w:r>
+      <w:r>
+        <w:rPr>
+          <w:rStyle w:val="CommentTok"/>
+        </w:rPr>
+        <w:t xml:space="preserve">/** Text and email the owner the first time the AI goes down (at most once an hour). Never throws. */</w:t>
+      </w:r>
+      <w:r>
+        <w:br/>
+      </w:r>
+      <w:r>
+        <w:rPr>
+          <w:rStyle w:val="ImportTok"/>
+        </w:rPr>
+        <w:t xml:space="preserve">export</w:t>
+      </w:r>
+      <w:r>
+        <w:rPr>
+          <w:rStyle w:val="NormalTok"/>
+        </w:rPr>
+        <w:t xml:space="preserve"> </w:t>
+      </w:r>
+      <w:r>
+        <w:rPr>
+          <w:rStyle w:val="KeywordTok"/>
+        </w:rPr>
+        <w:t xml:space="preserve">async</w:t>
+      </w:r>
+      <w:r>
+        <w:rPr>
+          <w:rStyle w:val="NormalTok"/>
+        </w:rPr>
+        <w:t xml:space="preserve"> </w:t>
+      </w:r>
+      <w:r>
+        <w:rPr>
+          <w:rStyle w:val="KeywordTok"/>
+        </w:rPr>
+        <w:t xml:space="preserve">function</w:t>
+      </w:r>
+      <w:r>
+        <w:rPr>
+          <w:rStyle w:val="NormalTok"/>
+        </w:rPr>
+        <w:t xml:space="preserve"> </w:t>
+      </w:r>
+      <w:r>
+        <w:rPr>
+          <w:rStyle w:val="FunctionTok"/>
+        </w:rPr>
+        <w:t xml:space="preserve">reportAiDown</w:t>
+      </w:r>
+      <w:r>
+        <w:rPr>
+          <w:rStyle w:val="NormalTok"/>
+        </w:rPr>
+        <w:t xml:space="preserve">(e</w:t>
+      </w:r>
+      <w:r>
+        <w:rPr>
+          <w:rStyle w:val="OperatorTok"/>
+        </w:rPr>
+        <w:t xml:space="preserve">:</w:t>
+      </w:r>
+      <w:r>
+        <w:rPr>
+          <w:rStyle w:val="NormalTok"/>
+        </w:rPr>
+        <w:t xml:space="preserve"> </w:t>
+      </w:r>
+      <w:r>
+        <w:rPr>
+          <w:rStyle w:val="DataTypeTok"/>
+        </w:rPr>
+        <w:t xml:space="preserve">unknown</w:t>
+      </w:r>
+      <w:r>
+        <w:rPr>
+          <w:rStyle w:val="NormalTok"/>
+        </w:rPr>
+        <w:t xml:space="preserve">)</w:t>
+      </w:r>
+      <w:r>
+        <w:rPr>
+          <w:rStyle w:val="OperatorTok"/>
+        </w:rPr>
+        <w:t xml:space="preserve">:</w:t>
+      </w:r>
+      <w:r>
+        <w:rPr>
+          <w:rStyle w:val="NormalTok"/>
+        </w:rPr>
+        <w:t xml:space="preserve"> </w:t>
+      </w:r>
+      <w:r>
+        <w:rPr>
+          <w:rStyle w:val="BuiltInTok"/>
+        </w:rPr>
+        <w:t xml:space="preserve">Promise</w:t>
+      </w:r>
+      <w:r>
+        <w:rPr>
+          <w:rStyle w:val="OperatorTok"/>
+        </w:rPr>
+        <w:t xml:space="preserve">&lt;</w:t>
+      </w:r>
+      <w:r>
+        <w:rPr>
+          <w:rStyle w:val="DataTypeTok"/>
+        </w:rPr>
+        <w:t xml:space="preserve">void</w:t>
+      </w:r>
+      <w:r>
+        <w:rPr>
+          <w:rStyle w:val="OperatorTok"/>
+        </w:rPr>
+        <w:t xml:space="preserve">&gt;</w:t>
+      </w:r>
+      <w:r>
+        <w:rPr>
+          <w:rStyle w:val="NormalTok"/>
+        </w:rPr>
+        <w:t xml:space="preserve"> {</w:t>
+      </w:r>
+      <w:r>
+        <w:br/>
+      </w:r>
+      <w:r>
+        <w:rPr>
+          <w:rStyle w:val="NormalTok"/>
+        </w:rPr>
+        <w:t xml:space="preserve">  </w:t>
+      </w:r>
+      <w:r>
+        <w:rPr>
+          <w:rStyle w:val="ControlFlowTok"/>
+        </w:rPr>
+        <w:t xml:space="preserve">try</w:t>
+      </w:r>
+      <w:r>
+        <w:rPr>
+          <w:rStyle w:val="NormalTok"/>
+        </w:rPr>
+        <w:t xml:space="preserve"> {</w:t>
+      </w:r>
+      <w:r>
+        <w:br/>
+      </w:r>
+      <w:r>
+        <w:rPr>
+          <w:rStyle w:val="NormalTok"/>
+        </w:rPr>
+        <w:t xml:space="preserve">    </w:t>
+      </w:r>
+      <w:r>
+        <w:rPr>
+          <w:rStyle w:val="KeywordTok"/>
+        </w:rPr>
+        <w:t xml:space="preserve">const</w:t>
+      </w:r>
+      <w:r>
+        <w:rPr>
+          <w:rStyle w:val="NormalTok"/>
+        </w:rPr>
+        <w:t xml:space="preserve"> { admin } </w:t>
+      </w:r>
+      <w:r>
+        <w:rPr>
+          <w:rStyle w:val="OperatorTok"/>
+        </w:rPr>
+        <w:t xml:space="preserve">=</w:t>
+      </w:r>
+      <w:r>
+        <w:rPr>
+          <w:rStyle w:val="NormalTok"/>
+        </w:rPr>
+        <w:t xml:space="preserve"> </w:t>
+      </w:r>
+      <w:r>
+        <w:rPr>
+          <w:rStyle w:val="ControlFlowTok"/>
+        </w:rPr>
+        <w:t xml:space="preserve">await</w:t>
+      </w:r>
+      <w:r>
+        <w:rPr>
+          <w:rStyle w:val="NormalTok"/>
+        </w:rPr>
+        <w:t xml:space="preserve"> </w:t>
+      </w:r>
+      <w:r>
+        <w:rPr>
+          <w:rStyle w:val="ImportTok"/>
+        </w:rPr>
+        <w:t xml:space="preserve">import</w:t>
+      </w:r>
+      <w:r>
+        <w:rPr>
+          <w:rStyle w:val="NormalTok"/>
+        </w:rPr>
+        <w:t xml:space="preserve">(</w:t>
+      </w:r>
+      <w:r>
+        <w:rPr>
+          <w:rStyle w:val="StringTok"/>
+        </w:rPr>
+        <w:t xml:space="preserve">"@/lib/stripe"</w:t>
+      </w:r>
+      <w:r>
+        <w:rPr>
+          <w:rStyle w:val="NormalTok"/>
+        </w:rPr>
+        <w:t xml:space="preserve">)</w:t>
+      </w:r>
+      <w:r>
+        <w:rPr>
+          <w:rStyle w:val="OperatorTok"/>
+        </w:rPr>
+        <w:t xml:space="preserve">;</w:t>
+      </w:r>
+      <w:r>
+        <w:br/>
+      </w:r>
+      <w:r>
+        <w:rPr>
+          <w:rStyle w:val="NormalTok"/>
+        </w:rPr>
+        <w:t xml:space="preserve">    </w:t>
+      </w:r>
+      <w:r>
+        <w:rPr>
+          <w:rStyle w:val="KeywordTok"/>
+        </w:rPr>
+        <w:t xml:space="preserve">const</w:t>
+      </w:r>
+      <w:r>
+        <w:rPr>
+          <w:rStyle w:val="NormalTok"/>
+        </w:rPr>
+        <w:t xml:space="preserve"> d </w:t>
+      </w:r>
+      <w:r>
+        <w:rPr>
+          <w:rStyle w:val="OperatorTok"/>
+        </w:rPr>
+        <w:t xml:space="preserve">=</w:t>
+      </w:r>
+      <w:r>
+        <w:rPr>
+          <w:rStyle w:val="NormalTok"/>
+        </w:rPr>
+        <w:t xml:space="preserve"> </w:t>
+      </w:r>
+      <w:r>
+        <w:rPr>
+          <w:rStyle w:val="FunctionTok"/>
+        </w:rPr>
+        <w:t xml:space="preserve">admin</w:t>
+      </w:r>
+      <w:r>
+        <w:rPr>
+          <w:rStyle w:val="NormalTok"/>
+        </w:rPr>
+        <w:t xml:space="preserve">()</w:t>
+      </w:r>
+      <w:r>
+        <w:rPr>
+          <w:rStyle w:val="OperatorTok"/>
+        </w:rPr>
+        <w:t xml:space="preserve">;</w:t>
+      </w:r>
+      <w:r>
+        <w:br/>
+      </w:r>
+      <w:r>
+        <w:rPr>
+          <w:rStyle w:val="NormalTok"/>
+        </w:rPr>
+        <w:t xml:space="preserve">    </w:t>
+      </w:r>
+      <w:r>
+        <w:rPr>
+          <w:rStyle w:val="KeywordTok"/>
+        </w:rPr>
+        <w:t xml:space="preserve">const</w:t>
+      </w:r>
+      <w:r>
+        <w:rPr>
+          <w:rStyle w:val="NormalTok"/>
+        </w:rPr>
+        <w:t xml:space="preserve"> key </w:t>
+      </w:r>
+      <w:r>
+        <w:rPr>
+          <w:rStyle w:val="OperatorTok"/>
+        </w:rPr>
+        <w:t xml:space="preserve">=</w:t>
+      </w:r>
+      <w:r>
+        <w:rPr>
+          <w:rStyle w:val="NormalTok"/>
+        </w:rPr>
+        <w:t xml:space="preserve"> </w:t>
+      </w:r>
+      <w:r>
+        <w:rPr>
+          <w:rStyle w:val="StringTok"/>
+        </w:rPr>
+        <w:t xml:space="preserve">"err:ai_down:last_alert"</w:t>
+      </w:r>
+      <w:r>
+        <w:rPr>
+          <w:rStyle w:val="OperatorTok"/>
+        </w:rPr>
+        <w:t xml:space="preserve">;</w:t>
+      </w:r>
+      <w:r>
+        <w:br/>
+      </w:r>
+      <w:r>
+        <w:rPr>
+          <w:rStyle w:val="NormalTok"/>
+        </w:rPr>
+        <w:t xml:space="preserve">    </w:t>
+      </w:r>
+      <w:r>
+        <w:rPr>
+          <w:rStyle w:val="KeywordTok"/>
+        </w:rPr>
+        <w:t xml:space="preserve">const</w:t>
+      </w:r>
+      <w:r>
+        <w:rPr>
+          <w:rStyle w:val="NormalTok"/>
+        </w:rPr>
+        <w:t xml:space="preserve"> { data } </w:t>
+      </w:r>
+      <w:r>
+        <w:rPr>
+          <w:rStyle w:val="OperatorTok"/>
+        </w:rPr>
+        <w:t xml:space="preserve">=</w:t>
+      </w:r>
+      <w:r>
+        <w:rPr>
+          <w:rStyle w:val="NormalTok"/>
+        </w:rPr>
+        <w:t xml:space="preserve"> </w:t>
+      </w:r>
+      <w:r>
+        <w:rPr>
+          <w:rStyle w:val="ControlFlowTok"/>
+        </w:rPr>
+        <w:t xml:space="preserve">await</w:t>
+      </w:r>
+      <w:r>
+        <w:rPr>
+          <w:rStyle w:val="NormalTok"/>
+        </w:rPr>
+        <w:t xml:space="preserve"> d</w:t>
+      </w:r>
+      <w:r>
+        <w:rPr>
+          <w:rStyle w:val="OperatorTok"/>
+        </w:rPr>
+        <w:t xml:space="preserve">.</w:t>
+      </w:r>
+      <w:r>
+        <w:rPr>
+          <w:rStyle w:val="FunctionTok"/>
+        </w:rPr>
+        <w:t xml:space="preserve">from</w:t>
+      </w:r>
+      <w:r>
+        <w:rPr>
+          <w:rStyle w:val="NormalTok"/>
+        </w:rPr>
+        <w:t xml:space="preserve">(</w:t>
+      </w:r>
+      <w:r>
+        <w:rPr>
+          <w:rStyle w:val="StringTok"/>
+        </w:rPr>
+        <w:t xml:space="preserve">"settings"</w:t>
+      </w:r>
+      <w:r>
+        <w:rPr>
+          <w:rStyle w:val="NormalTok"/>
+        </w:rPr>
+        <w:t xml:space="preserve">)</w:t>
+      </w:r>
+      <w:r>
+        <w:rPr>
+          <w:rStyle w:val="OperatorTok"/>
+        </w:rPr>
+        <w:t xml:space="preserve">.</w:t>
+      </w:r>
+      <w:r>
+        <w:rPr>
+          <w:rStyle w:val="FunctionTok"/>
+        </w:rPr>
+        <w:t xml:space="preserve">select</w:t>
+      </w:r>
+      <w:r>
+        <w:rPr>
+          <w:rStyle w:val="NormalTok"/>
+        </w:rPr>
+        <w:t xml:space="preserve">(</w:t>
+      </w:r>
+      <w:r>
+        <w:rPr>
+          <w:rStyle w:val="StringTok"/>
+        </w:rPr>
+        <w:t xml:space="preserve">"value"</w:t>
+      </w:r>
+      <w:r>
+        <w:rPr>
+          <w:rStyle w:val="NormalTok"/>
+        </w:rPr>
+        <w:t xml:space="preserve">)</w:t>
+      </w:r>
+      <w:r>
+        <w:rPr>
+          <w:rStyle w:val="OperatorTok"/>
+        </w:rPr>
+        <w:t xml:space="preserve">.</w:t>
+      </w:r>
+      <w:r>
+        <w:rPr>
+          <w:rStyle w:val="FunctionTok"/>
+        </w:rPr>
+        <w:t xml:space="preserve">eq</w:t>
+      </w:r>
+      <w:r>
+        <w:rPr>
+          <w:rStyle w:val="NormalTok"/>
+        </w:rPr>
+        <w:t xml:space="preserve">(</w:t>
+      </w:r>
+      <w:r>
+        <w:rPr>
+          <w:rStyle w:val="StringTok"/>
+        </w:rPr>
+        <w:t xml:space="preserve">"key"</w:t>
+      </w:r>
+      <w:r>
+        <w:rPr>
+          <w:rStyle w:val="OperatorTok"/>
+        </w:rPr>
+        <w:t xml:space="preserve">,</w:t>
+      </w:r>
+      <w:r>
+        <w:rPr>
+          <w:rStyle w:val="NormalTok"/>
+        </w:rPr>
+        <w:t xml:space="preserve"> key)</w:t>
+      </w:r>
+      <w:r>
+        <w:rPr>
+          <w:rStyle w:val="OperatorTok"/>
+        </w:rPr>
+        <w:t xml:space="preserve">.</w:t>
+      </w:r>
+      <w:r>
+        <w:rPr>
+          <w:rStyle w:val="FunctionTok"/>
+        </w:rPr>
+        <w:t xml:space="preserve">maybeSingle</w:t>
+      </w:r>
+      <w:r>
+        <w:rPr>
+          <w:rStyle w:val="NormalTok"/>
+        </w:rPr>
+        <w:t xml:space="preserve">()</w:t>
+      </w:r>
+      <w:r>
+        <w:rPr>
+          <w:rStyle w:val="OperatorTok"/>
+        </w:rPr>
+        <w:t xml:space="preserve">;</w:t>
+      </w:r>
+      <w:r>
+        <w:br/>
+      </w:r>
+      <w:r>
+        <w:rPr>
+          <w:rStyle w:val="NormalTok"/>
+        </w:rPr>
+        <w:t xml:space="preserve">    </w:t>
+      </w:r>
+      <w:r>
+        <w:rPr>
+          <w:rStyle w:val="KeywordTok"/>
+        </w:rPr>
+        <w:t xml:space="preserve">const</w:t>
+      </w:r>
+      <w:r>
+        <w:rPr>
+          <w:rStyle w:val="NormalTok"/>
+        </w:rPr>
+        <w:t xml:space="preserve"> last </w:t>
+      </w:r>
+      <w:r>
+        <w:rPr>
+          <w:rStyle w:val="OperatorTok"/>
+        </w:rPr>
+        <w:t xml:space="preserve">=</w:t>
+      </w:r>
+      <w:r>
+        <w:rPr>
+          <w:rStyle w:val="NormalTok"/>
+        </w:rPr>
+        <w:t xml:space="preserve"> </w:t>
+      </w:r>
+      <w:r>
+        <w:rPr>
+          <w:rStyle w:val="BuiltInTok"/>
+        </w:rPr>
+        <w:t xml:space="preserve">Number</w:t>
+      </w:r>
+      <w:r>
+        <w:rPr>
+          <w:rStyle w:val="NormalTok"/>
+        </w:rPr>
+        <w:t xml:space="preserve">((data</w:t>
+      </w:r>
+      <w:r>
+        <w:rPr>
+          <w:rStyle w:val="OperatorTok"/>
+        </w:rPr>
+        <w:t xml:space="preserve">?.</w:t>
+      </w:r>
+      <w:r>
+        <w:rPr>
+          <w:rStyle w:val="AttributeTok"/>
+        </w:rPr>
+        <w:t xml:space="preserve">value</w:t>
+      </w:r>
+      <w:r>
+        <w:rPr>
+          <w:rStyle w:val="NormalTok"/>
+        </w:rPr>
+        <w:t xml:space="preserve"> </w:t>
+      </w:r>
+      <w:r>
+        <w:rPr>
+          <w:rStyle w:val="ImportTok"/>
+        </w:rPr>
+        <w:t xml:space="preserve">as</w:t>
+      </w:r>
+      <w:r>
+        <w:rPr>
+          <w:rStyle w:val="NormalTok"/>
+        </w:rPr>
+        <w:t xml:space="preserve"> { at</w:t>
+      </w:r>
+      <w:r>
+        <w:rPr>
+          <w:rStyle w:val="OperatorTok"/>
+        </w:rPr>
+        <w:t xml:space="preserve">?:</w:t>
+      </w:r>
+      <w:r>
+        <w:rPr>
+          <w:rStyle w:val="NormalTok"/>
+        </w:rPr>
+        <w:t xml:space="preserve"> </w:t>
+      </w:r>
+      <w:r>
+        <w:rPr>
+          <w:rStyle w:val="DataTypeTok"/>
+        </w:rPr>
+        <w:t xml:space="preserve">number</w:t>
+      </w:r>
+      <w:r>
+        <w:rPr>
+          <w:rStyle w:val="NormalTok"/>
+        </w:rPr>
+        <w:t xml:space="preserve"> } </w:t>
+      </w:r>
+      <w:r>
+        <w:rPr>
+          <w:rStyle w:val="OperatorTok"/>
+        </w:rPr>
+        <w:t xml:space="preserve">|</w:t>
+      </w:r>
+      <w:r>
+        <w:rPr>
+          <w:rStyle w:val="NormalTok"/>
+        </w:rPr>
+        <w:t xml:space="preserve"> </w:t>
+      </w:r>
+      <w:r>
+        <w:rPr>
+          <w:rStyle w:val="DataTypeTok"/>
+        </w:rPr>
+        <w:t xml:space="preserve">null</w:t>
+      </w:r>
+      <w:r>
+        <w:rPr>
+          <w:rStyle w:val="NormalTok"/>
+        </w:rPr>
+        <w:t xml:space="preserve">)</w:t>
+      </w:r>
+      <w:r>
+        <w:rPr>
+          <w:rStyle w:val="OperatorTok"/>
+        </w:rPr>
+        <w:t xml:space="preserve">?.</w:t>
+      </w:r>
+      <w:r>
+        <w:rPr>
+          <w:rStyle w:val="AttributeTok"/>
+        </w:rPr>
+        <w:t xml:space="preserve">at</w:t>
+      </w:r>
+      <w:r>
+        <w:rPr>
+          <w:rStyle w:val="NormalTok"/>
+        </w:rPr>
+        <w:t xml:space="preserve"> </w:t>
+      </w:r>
+      <w:r>
+        <w:rPr>
+          <w:rStyle w:val="OperatorTok"/>
+        </w:rPr>
+        <w:t xml:space="preserve">||</w:t>
+      </w:r>
+      <w:r>
+        <w:rPr>
+          <w:rStyle w:val="NormalTok"/>
+        </w:rPr>
+        <w:t xml:space="preserve"> </w:t>
+      </w:r>
+      <w:r>
+        <w:rPr>
+          <w:rStyle w:val="DecValTok"/>
+        </w:rPr>
+        <w:t xml:space="preserve">0</w:t>
+      </w:r>
+      <w:r>
+        <w:rPr>
+          <w:rStyle w:val="NormalTok"/>
+        </w:rPr>
+        <w:t xml:space="preserve">)</w:t>
+      </w:r>
+      <w:r>
+        <w:rPr>
+          <w:rStyle w:val="OperatorTok"/>
+        </w:rPr>
+        <w:t xml:space="preserve">;</w:t>
+      </w:r>
+      <w:r>
+        <w:br/>
+      </w:r>
+      <w:r>
+        <w:rPr>
+          <w:rStyle w:val="NormalTok"/>
+        </w:rPr>
+        <w:t xml:space="preserve">    </w:t>
+      </w:r>
+      <w:r>
+        <w:rPr>
+          <w:rStyle w:val="KeywordTok"/>
+        </w:rPr>
+        <w:t xml:space="preserve">const</w:t>
+      </w:r>
+      <w:r>
+        <w:rPr>
+          <w:rStyle w:val="NormalTok"/>
+        </w:rPr>
+        <w:t xml:space="preserve"> now </w:t>
+      </w:r>
+      <w:r>
+        <w:rPr>
+          <w:rStyle w:val="OperatorTok"/>
+        </w:rPr>
+        <w:t xml:space="preserve">=</w:t>
+      </w:r>
+      <w:r>
+        <w:rPr>
+          <w:rStyle w:val="NormalTok"/>
+        </w:rPr>
+        <w:t xml:space="preserve"> </w:t>
+      </w:r>
+      <w:r>
+        <w:rPr>
+          <w:rStyle w:val="KeywordTok"/>
+        </w:rPr>
+        <w:t xml:space="preserve">new</w:t>
+      </w:r>
+      <w:r>
+        <w:rPr>
+          <w:rStyle w:val="NormalTok"/>
+        </w:rPr>
+        <w:t xml:space="preserve"> </w:t>
+      </w:r>
+      <w:r>
+        <w:rPr>
+          <w:rStyle w:val="BuiltInTok"/>
+        </w:rPr>
+        <w:t xml:space="preserve">Date</w:t>
+      </w:r>
+      <w:r>
+        <w:rPr>
+          <w:rStyle w:val="NormalTok"/>
+        </w:rPr>
+        <w:t xml:space="preserve">()</w:t>
+      </w:r>
+      <w:r>
+        <w:rPr>
+          <w:rStyle w:val="OperatorTok"/>
+        </w:rPr>
+        <w:t xml:space="preserve">.</w:t>
+      </w:r>
+      <w:r>
+        <w:rPr>
+          <w:rStyle w:val="FunctionTok"/>
+        </w:rPr>
+        <w:t xml:space="preserve">getTime</w:t>
+      </w:r>
+      <w:r>
+        <w:rPr>
+          <w:rStyle w:val="NormalTok"/>
+        </w:rPr>
+        <w:t xml:space="preserve">()</w:t>
+      </w:r>
+      <w:r>
+        <w:rPr>
+          <w:rStyle w:val="OperatorTok"/>
+        </w:rPr>
+        <w:t xml:space="preserve">;</w:t>
+      </w:r>
+      <w:r>
+        <w:br/>
+      </w:r>
+      <w:r>
+        <w:rPr>
+          <w:rStyle w:val="NormalTok"/>
+        </w:rPr>
+        <w:t xml:space="preserve">    </w:t>
+      </w:r>
+      <w:r>
+        <w:rPr>
+          <w:rStyle w:val="ControlFlowTok"/>
+        </w:rPr>
+        <w:t xml:space="preserve">if</w:t>
+      </w:r>
+      <w:r>
+        <w:rPr>
+          <w:rStyle w:val="NormalTok"/>
+        </w:rPr>
+        <w:t xml:space="preserve"> (now </w:t>
+      </w:r>
+      <w:r>
+        <w:rPr>
+          <w:rStyle w:val="OperatorTok"/>
+        </w:rPr>
+        <w:t xml:space="preserve">-</w:t>
+      </w:r>
+      <w:r>
+        <w:rPr>
+          <w:rStyle w:val="NormalTok"/>
+        </w:rPr>
+        <w:t xml:space="preserve"> last </w:t>
+      </w:r>
+      <w:r>
+        <w:rPr>
+          <w:rStyle w:val="OperatorTok"/>
+        </w:rPr>
+        <w:t xml:space="preserve">&lt;</w:t>
+      </w:r>
+      <w:r>
+        <w:rPr>
+          <w:rStyle w:val="NormalTok"/>
+        </w:rPr>
+        <w:t xml:space="preserve"> </w:t>
+      </w:r>
+      <w:r>
+        <w:rPr>
+          <w:rStyle w:val="DecValTok"/>
+        </w:rPr>
+        <w:t xml:space="preserve">3600_000</w:t>
+      </w:r>
+      <w:r>
+        <w:rPr>
+          <w:rStyle w:val="NormalTok"/>
+        </w:rPr>
+        <w:t xml:space="preserve">) </w:t>
+      </w:r>
+      <w:r>
+        <w:rPr>
+          <w:rStyle w:val="ControlFlowTok"/>
+        </w:rPr>
+        <w:t xml:space="preserve">return</w:t>
+      </w:r>
+      <w:r>
+        <w:rPr>
+          <w:rStyle w:val="OperatorTok"/>
+        </w:rPr>
+        <w:t xml:space="preserve">;</w:t>
+      </w:r>
+      <w:r>
+        <w:br/>
+      </w:r>
+      <w:r>
+        <w:rPr>
+          <w:rStyle w:val="NormalTok"/>
+        </w:rPr>
+        <w:t xml:space="preserve">    </w:t>
+      </w:r>
+      <w:r>
+        <w:rPr>
+          <w:rStyle w:val="ControlFlowTok"/>
+        </w:rPr>
+        <w:t xml:space="preserve">await</w:t>
+      </w:r>
+      <w:r>
+        <w:rPr>
+          <w:rStyle w:val="NormalTok"/>
+        </w:rPr>
+        <w:t xml:space="preserve"> d</w:t>
+      </w:r>
+      <w:r>
+        <w:rPr>
+          <w:rStyle w:val="OperatorTok"/>
+        </w:rPr>
+        <w:t xml:space="preserve">.</w:t>
+      </w:r>
+      <w:r>
+        <w:rPr>
+          <w:rStyle w:val="FunctionTok"/>
+        </w:rPr>
+        <w:t xml:space="preserve">from</w:t>
+      </w:r>
+      <w:r>
+        <w:rPr>
+          <w:rStyle w:val="NormalTok"/>
+        </w:rPr>
+        <w:t xml:space="preserve">(</w:t>
+      </w:r>
+      <w:r>
+        <w:rPr>
+          <w:rStyle w:val="StringTok"/>
+        </w:rPr>
+        <w:t xml:space="preserve">"settings"</w:t>
+      </w:r>
+      <w:r>
+        <w:rPr>
+          <w:rStyle w:val="NormalTok"/>
+        </w:rPr>
+        <w:t xml:space="preserve">)</w:t>
+      </w:r>
+      <w:r>
+        <w:rPr>
+          <w:rStyle w:val="OperatorTok"/>
+        </w:rPr>
+        <w:t xml:space="preserve">.</w:t>
+      </w:r>
+      <w:r>
+        <w:rPr>
+          <w:rStyle w:val="FunctionTok"/>
+        </w:rPr>
+        <w:t xml:space="preserve">upsert</w:t>
+      </w:r>
+      <w:r>
+        <w:rPr>
+          <w:rStyle w:val="NormalTok"/>
+        </w:rPr>
+        <w:t xml:space="preserve">({ key</w:t>
+      </w:r>
+      <w:r>
+        <w:rPr>
+          <w:rStyle w:val="OperatorTok"/>
+        </w:rPr>
+        <w:t xml:space="preserve">,</w:t>
+      </w:r>
+      <w:r>
+        <w:rPr>
+          <w:rStyle w:val="NormalTok"/>
+        </w:rPr>
+        <w:t xml:space="preserve"> value</w:t>
+      </w:r>
+      <w:r>
+        <w:rPr>
+          <w:rStyle w:val="OperatorTok"/>
+        </w:rPr>
+        <w:t xml:space="preserve">:</w:t>
+      </w:r>
+      <w:r>
+        <w:rPr>
+          <w:rStyle w:val="NormalTok"/>
+        </w:rPr>
+        <w:t xml:space="preserve"> { at</w:t>
+      </w:r>
+      <w:r>
+        <w:rPr>
+          <w:rStyle w:val="OperatorTok"/>
+        </w:rPr>
+        <w:t xml:space="preserve">:</w:t>
+      </w:r>
+      <w:r>
+        <w:rPr>
+          <w:rStyle w:val="NormalTok"/>
+        </w:rPr>
+        <w:t xml:space="preserve"> now } })</w:t>
+      </w:r>
+      <w:r>
+        <w:rPr>
+          <w:rStyle w:val="OperatorTok"/>
+        </w:rPr>
+        <w:t xml:space="preserve">;</w:t>
+      </w:r>
+      <w:r>
+        <w:br/>
+      </w:r>
+      <w:r>
+        <w:rPr>
+          <w:rStyle w:val="NormalTok"/>
+        </w:rPr>
+        <w:t xml:space="preserve">    </w:t>
+      </w:r>
+      <w:r>
+        <w:rPr>
+          <w:rStyle w:val="KeywordTok"/>
+        </w:rPr>
+        <w:t xml:space="preserve">const</w:t>
+      </w:r>
+      <w:r>
+        <w:rPr>
+          <w:rStyle w:val="NormalTok"/>
+        </w:rPr>
+        <w:t xml:space="preserve"> msg </w:t>
+      </w:r>
+      <w:r>
+        <w:rPr>
+          <w:rStyle w:val="OperatorTok"/>
+        </w:rPr>
+        <w:t xml:space="preserve">=</w:t>
+      </w:r>
+      <w:r>
+        <w:rPr>
+          <w:rStyle w:val="NormalTok"/>
+        </w:rPr>
+        <w:t xml:space="preserve"> (e </w:t>
+      </w:r>
+      <w:r>
+        <w:rPr>
+          <w:rStyle w:val="KeywordTok"/>
+        </w:rPr>
+        <w:t xml:space="preserve">instanceof</w:t>
+      </w:r>
+      <w:r>
+        <w:rPr>
+          <w:rStyle w:val="NormalTok"/>
+        </w:rPr>
+        <w:t xml:space="preserve"> </w:t>
+      </w:r>
+      <w:r>
+        <w:rPr>
+          <w:rStyle w:val="BuiltInTok"/>
+        </w:rPr>
+        <w:t xml:space="preserve">Error</w:t>
+      </w:r>
+      <w:r>
+        <w:rPr>
+          <w:rStyle w:val="NormalTok"/>
+        </w:rPr>
+        <w:t xml:space="preserve"> </w:t>
+      </w:r>
+      <w:r>
+        <w:rPr>
+          <w:rStyle w:val="OperatorTok"/>
+        </w:rPr>
+        <w:t xml:space="preserve">?</w:t>
+      </w:r>
+      <w:r>
+        <w:rPr>
+          <w:rStyle w:val="NormalTok"/>
+        </w:rPr>
+        <w:t xml:space="preserve"> e</w:t>
+      </w:r>
+      <w:r>
+        <w:rPr>
+          <w:rStyle w:val="OperatorTok"/>
+        </w:rPr>
+        <w:t xml:space="preserve">.</w:t>
+      </w:r>
+      <w:r>
+        <w:rPr>
+          <w:rStyle w:val="AttributeTok"/>
+        </w:rPr>
+        <w:t xml:space="preserve">message</w:t>
+      </w:r>
+      <w:r>
+        <w:rPr>
+          <w:rStyle w:val="NormalTok"/>
+        </w:rPr>
+        <w:t xml:space="preserve"> </w:t>
+      </w:r>
+      <w:r>
+        <w:rPr>
+          <w:rStyle w:val="OperatorTok"/>
+        </w:rPr>
+        <w:t xml:space="preserve">:</w:t>
+      </w:r>
+      <w:r>
+        <w:rPr>
+          <w:rStyle w:val="NormalTok"/>
+        </w:rPr>
+        <w:t xml:space="preserve"> </w:t>
+      </w:r>
+      <w:r>
+        <w:rPr>
+          <w:rStyle w:val="BuiltInTok"/>
+        </w:rPr>
+        <w:t xml:space="preserve">String</w:t>
+      </w:r>
+      <w:r>
+        <w:rPr>
+          <w:rStyle w:val="NormalTok"/>
+        </w:rPr>
+        <w:t xml:space="preserve">(e))</w:t>
+      </w:r>
+      <w:r>
+        <w:rPr>
+          <w:rStyle w:val="OperatorTok"/>
+        </w:rPr>
+        <w:t xml:space="preserve">.</w:t>
+      </w:r>
+      <w:r>
+        <w:rPr>
+          <w:rStyle w:val="FunctionTok"/>
+        </w:rPr>
+        <w:t xml:space="preserve">slice</w:t>
+      </w:r>
+      <w:r>
+        <w:rPr>
+          <w:rStyle w:val="NormalTok"/>
+        </w:rPr>
+        <w:t xml:space="preserve">(</w:t>
+      </w:r>
+      <w:r>
+        <w:rPr>
+          <w:rStyle w:val="DecValTok"/>
+        </w:rPr>
+        <w:t xml:space="preserve">0</w:t>
+      </w:r>
+      <w:r>
+        <w:rPr>
+          <w:rStyle w:val="OperatorTok"/>
+        </w:rPr>
+        <w:t xml:space="preserve">,</w:t>
+      </w:r>
+      <w:r>
+        <w:rPr>
+          <w:rStyle w:val="NormalTok"/>
+        </w:rPr>
+        <w:t xml:space="preserve"> </w:t>
+      </w:r>
+      <w:r>
+        <w:rPr>
+          <w:rStyle w:val="DecValTok"/>
+        </w:rPr>
+        <w:t xml:space="preserve">200</w:t>
+      </w:r>
+      <w:r>
+        <w:rPr>
+          <w:rStyle w:val="NormalTok"/>
+        </w:rPr>
+        <w:t xml:space="preserve">)</w:t>
+      </w:r>
+      <w:r>
+        <w:rPr>
+          <w:rStyle w:val="OperatorTok"/>
+        </w:rPr>
+        <w:t xml:space="preserve">;</w:t>
+      </w:r>
+      <w:r>
+        <w:br/>
+      </w:r>
+      <w:r>
+        <w:rPr>
+          <w:rStyle w:val="NormalTok"/>
+        </w:rPr>
+        <w:t xml:space="preserve">    </w:t>
+      </w:r>
+      <w:r>
+        <w:rPr>
+          <w:rStyle w:val="KeywordTok"/>
+        </w:rPr>
+        <w:t xml:space="preserve">const</w:t>
+      </w:r>
+      <w:r>
+        <w:rPr>
+          <w:rStyle w:val="NormalTok"/>
+        </w:rPr>
+        <w:t xml:space="preserve"> credit </w:t>
+      </w:r>
+      <w:r>
+        <w:rPr>
+          <w:rStyle w:val="OperatorTok"/>
+        </w:rPr>
+        <w:t xml:space="preserve">=</w:t>
+      </w:r>
+      <w:r>
+        <w:rPr>
+          <w:rStyle w:val="NormalTok"/>
+        </w:rPr>
+        <w:t xml:space="preserve"> </w:t>
+      </w:r>
+      <w:r>
+        <w:rPr>
+          <w:rStyle w:val="SpecialStringTok"/>
+        </w:rPr>
+        <w:t xml:space="preserve">/credit balance</w:t>
+      </w:r>
+      <w:r>
+        <w:rPr>
+          <w:rStyle w:val="SpecialCharTok"/>
+        </w:rPr>
+        <w:t xml:space="preserve">|</w:t>
+      </w:r>
+      <w:r>
+        <w:rPr>
+          <w:rStyle w:val="SpecialStringTok"/>
+        </w:rPr>
+        <w:t xml:space="preserve">billing/i</w:t>
+      </w:r>
+      <w:r>
+        <w:rPr>
+          <w:rStyle w:val="OperatorTok"/>
+        </w:rPr>
+        <w:t xml:space="preserve">.</w:t>
+      </w:r>
+      <w:r>
+        <w:rPr>
+          <w:rStyle w:val="FunctionTok"/>
+        </w:rPr>
+        <w:t xml:space="preserve">test</w:t>
+      </w:r>
+      <w:r>
+        <w:rPr>
+          <w:rStyle w:val="NormalTok"/>
+        </w:rPr>
+        <w:t xml:space="preserve">(msg)</w:t>
+      </w:r>
+      <w:r>
+        <w:rPr>
+          <w:rStyle w:val="OperatorTok"/>
+        </w:rPr>
+        <w:t xml:space="preserve">;</w:t>
+      </w:r>
+      <w:r>
+        <w:br/>
+      </w:r>
+      <w:r>
+        <w:rPr>
+          <w:rStyle w:val="NormalTok"/>
+        </w:rPr>
+        <w:t xml:space="preserve">    </w:t>
+      </w:r>
+      <w:r>
+        <w:rPr>
+          <w:rStyle w:val="KeywordTok"/>
+        </w:rPr>
+        <w:t xml:space="preserve">const</w:t>
+      </w:r>
+      <w:r>
+        <w:rPr>
+          <w:rStyle w:val="NormalTok"/>
+        </w:rPr>
+        <w:t xml:space="preserve"> { alertStaff } </w:t>
+      </w:r>
+      <w:r>
+        <w:rPr>
+          <w:rStyle w:val="OperatorTok"/>
+        </w:rPr>
+        <w:t xml:space="preserve">=</w:t>
+      </w:r>
+      <w:r>
+        <w:rPr>
+          <w:rStyle w:val="NormalTok"/>
+        </w:rPr>
+        <w:t xml:space="preserve"> </w:t>
+      </w:r>
+      <w:r>
+        <w:rPr>
+          <w:rStyle w:val="ControlFlowTok"/>
+        </w:rPr>
+        <w:t xml:space="preserve">await</w:t>
+      </w:r>
+      <w:r>
+        <w:rPr>
+          <w:rStyle w:val="NormalTok"/>
+        </w:rPr>
+        <w:t xml:space="preserve"> </w:t>
+      </w:r>
+      <w:r>
+        <w:rPr>
+          <w:rStyle w:val="ImportTok"/>
+        </w:rPr>
+        <w:t xml:space="preserve">import</w:t>
+      </w:r>
+      <w:r>
+        <w:rPr>
+          <w:rStyle w:val="NormalTok"/>
+        </w:rPr>
+        <w:t xml:space="preserve">(</w:t>
+      </w:r>
+      <w:r>
+        <w:rPr>
+          <w:rStyle w:val="StringTok"/>
+        </w:rPr>
+        <w:t xml:space="preserve">"@/lib/alert"</w:t>
+      </w:r>
+      <w:r>
+        <w:rPr>
+          <w:rStyle w:val="NormalTok"/>
+        </w:rPr>
+        <w:t xml:space="preserve">)</w:t>
+      </w:r>
+      <w:r>
+        <w:rPr>
+          <w:rStyle w:val="OperatorTok"/>
+        </w:rPr>
+        <w:t xml:space="preserve">;</w:t>
+      </w:r>
+      <w:r>
+        <w:br/>
+      </w:r>
+      <w:r>
+        <w:rPr>
+          <w:rStyle w:val="NormalTok"/>
+        </w:rPr>
+        <w:t xml:space="preserve">    </w:t>
+      </w:r>
+      <w:r>
+        <w:rPr>
+          <w:rStyle w:val="ControlFlowTok"/>
+        </w:rPr>
+        <w:t xml:space="preserve">await</w:t>
+      </w:r>
+      <w:r>
+        <w:rPr>
+          <w:rStyle w:val="NormalTok"/>
+        </w:rPr>
+        <w:t xml:space="preserve"> </w:t>
+      </w:r>
+      <w:r>
+        <w:rPr>
+          <w:rStyle w:val="FunctionTok"/>
+        </w:rPr>
+        <w:t xml:space="preserve">alertStaff</w:t>
+      </w:r>
+      <w:r>
+        <w:rPr>
+          <w:rStyle w:val="NormalTok"/>
+        </w:rPr>
+        <w:t xml:space="preserve">(credit </w:t>
+      </w:r>
+      <w:r>
+        <w:rPr>
+          <w:rStyle w:val="OperatorTok"/>
+        </w:rPr>
+        <w:t xml:space="preserve">?</w:t>
+      </w:r>
+      <w:r>
+        <w:rPr>
+          <w:rStyle w:val="NormalTok"/>
+        </w:rPr>
+        <w:t xml:space="preserve"> </w:t>
+      </w:r>
+      <w:r>
+        <w:rPr>
+          <w:rStyle w:val="StringTok"/>
+        </w:rPr>
+        <w:t xml:space="preserve">"AI is OFF: out of prepaid credit"</w:t>
+      </w:r>
+      <w:r>
+        <w:rPr>
+          <w:rStyle w:val="NormalTok"/>
+        </w:rPr>
+        <w:t xml:space="preserve"> </w:t>
+      </w:r>
+      <w:r>
+        <w:rPr>
+          <w:rStyle w:val="OperatorTok"/>
+        </w:rPr>
+        <w:t xml:space="preserve">:</w:t>
+      </w:r>
+      <w:r>
+        <w:rPr>
+          <w:rStyle w:val="NormalTok"/>
+        </w:rPr>
+        <w:t xml:space="preserve"> </w:t>
+      </w:r>
+      <w:r>
+        <w:rPr>
+          <w:rStyle w:val="StringTok"/>
+        </w:rPr>
+        <w:t xml:space="preserve">"AI tools are failing"</w:t>
+      </w:r>
+      <w:r>
+        <w:rPr>
+          <w:rStyle w:val="OperatorTok"/>
+        </w:rPr>
+        <w:t xml:space="preserve">,</w:t>
+      </w:r>
+      <w:r>
+        <w:br/>
+      </w:r>
+      <w:r>
+        <w:rPr>
+          <w:rStyle w:val="NormalTok"/>
+        </w:rPr>
+        <w:t xml:space="preserve">      credit</w:t>
+      </w:r>
+      <w:r>
+        <w:br/>
+      </w:r>
+      <w:r>
+        <w:rPr>
+          <w:rStyle w:val="NormalTok"/>
+        </w:rPr>
+        <w:t xml:space="preserve">        </w:t>
+      </w:r>
+      <w:r>
+        <w:rPr>
+          <w:rStyle w:val="OperatorTok"/>
+        </w:rPr>
+        <w:t xml:space="preserve">?</w:t>
+      </w:r>
+      <w:r>
+        <w:rPr>
+          <w:rStyle w:val="NormalTok"/>
+        </w:rPr>
+        <w:t xml:space="preserve"> </w:t>
+      </w:r>
+      <w:r>
+        <w:rPr>
+          <w:rStyle w:val="StringTok"/>
+        </w:rPr>
+        <w:t xml:space="preserve">"Every AI tool (What's it worth, listings, Sort the pile, Buy or Pass, Help) is stopped until credit is added. Customers see a short-break message and aren't charged. Fix: platform.claude.com, sign in, Settings, Billing, Buy credits. Turn on Auto-reload there so it can't run out again."</w:t>
+      </w:r>
+      <w:r>
+        <w:br/>
+      </w:r>
+      <w:r>
+        <w:rPr>
+          <w:rStyle w:val="NormalTok"/>
+        </w:rPr>
+        <w:t xml:space="preserve">        </w:t>
+      </w:r>
+      <w:r>
+        <w:rPr>
+          <w:rStyle w:val="OperatorTok"/>
+        </w:rPr>
+        <w:t xml:space="preserve">:</w:t>
+      </w:r>
+      <w:r>
+        <w:rPr>
+          <w:rStyle w:val="NormalTok"/>
+        </w:rPr>
+        <w:t xml:space="preserve"> </w:t>
+      </w:r>
+      <w:r>
+        <w:rPr>
+          <w:rStyle w:val="VerbatimStringTok"/>
+        </w:rPr>
+        <w:t xml:space="preserve">`The AI service is refusing requests: </w:t>
+      </w:r>
+      <w:r>
+        <w:rPr>
+          <w:rStyle w:val="SpecialCharTok"/>
+        </w:rPr>
+        <w:t xml:space="preserve">${</w:t>
+      </w:r>
+      <w:r>
+        <w:rPr>
+          <w:rStyle w:val="NormalTok"/>
+        </w:rPr>
+        <w:t xml:space="preserve">msg</w:t>
+      </w:r>
+      <w:r>
+        <w:rPr>
+          <w:rStyle w:val="SpecialCharTok"/>
+        </w:rPr>
+        <w:t xml:space="preserve">}</w:t>
+      </w:r>
+      <w:r>
+        <w:rPr>
+          <w:rStyle w:val="VerbatimStringTok"/>
+        </w:rPr>
+        <w:t xml:space="preserve">. Customers see a short-break message and aren't charged. Tell Claude.`</w:t>
+      </w:r>
+      <w:r>
+        <w:rPr>
+          <w:rStyle w:val="OperatorTok"/>
+        </w:rPr>
+        <w:t xml:space="preserve">,</w:t>
+      </w:r>
+      <w:r>
+        <w:br/>
+      </w:r>
+      <w:r>
+        <w:rPr>
+          <w:rStyle w:val="NormalTok"/>
+        </w:rPr>
+        <w:t xml:space="preserve">      </w:t>
+      </w:r>
+      <w:r>
+        <w:rPr>
+          <w:rStyle w:val="StringTok"/>
+        </w:rPr>
+        <w:t xml:space="preserve">"/app/ops"</w:t>
+      </w:r>
+      <w:r>
+        <w:rPr>
+          <w:rStyle w:val="NormalTok"/>
+        </w:rPr>
+        <w:t xml:space="preserve">)</w:t>
+      </w:r>
+      <w:r>
+        <w:rPr>
+          <w:rStyle w:val="OperatorTok"/>
+        </w:rPr>
+        <w:t xml:space="preserve">;</w:t>
+      </w:r>
+      <w:r>
+        <w:br/>
+      </w:r>
+      <w:r>
+        <w:rPr>
+          <w:rStyle w:val="NormalTok"/>
+        </w:rPr>
+        <w:t xml:space="preserve">  } </w:t>
+      </w:r>
+      <w:r>
+        <w:rPr>
+          <w:rStyle w:val="ControlFlowTok"/>
+        </w:rPr>
+        <w:t xml:space="preserve">catch</w:t>
+      </w:r>
+      <w:r>
+        <w:rPr>
+          <w:rStyle w:val="NormalTok"/>
+        </w:rPr>
+        <w:t xml:space="preserve"> { </w:t>
+      </w:r>
+      <w:r>
+        <w:rPr>
+          <w:rStyle w:val="CommentTok"/>
+        </w:rPr>
+        <w:t xml:space="preserve">/* alerts must never break a request */</w:t>
+      </w:r>
+      <w:r>
+        <w:rPr>
+          <w:rStyle w:val="NormalTok"/>
+        </w:rPr>
+        <w:t xml:space="preserve"> }</w:t>
       </w:r>
       <w:r>
         <w:br/>
@@ -50532,16 +52731,20 @@
         <w:pStyle w:val="Compact"/>
       </w:pPr>
       <w:r>
-        <w:t xml:space="preserve">Free-form JSON breaks ($ signs, ranges like "50-80"); use forced tools (</w:t>
-      </w:r>
-      <w:r>
-        <w:rPr>
-          <w:rStyle w:val="VerbatimChar"/>
-        </w:rPr>
-        <w:t xml:space="preserve">askWithTool</w:t>
-      </w:r>
-      <w:r>
-        <w:t xml:space="preserve">).</w:t>
+        <w:t xml:space="preserve">The API is</w:t>
+      </w:r>
+      <w:r>
+        <w:t xml:space="preserve"> </w:t>
+      </w:r>
+      <w:r>
+        <w:rPr>
+          <w:bCs/>
+          <w:b/>
+        </w:rPr>
+        <w:t xml:space="preserve">prepaid</w:t>
+      </w:r>
+      <w:r>
+        <w:t xml:space="preserve">. When the balance hits zero, every call fails with 400 "Your credit balance is too low." Turn on auto-reload (Console → Settings → Billing → Auto-reload) on day zero (T-57).</w:t>
       </w:r>
     </w:p>
     <w:p>
@@ -50553,7 +52756,16 @@
         <w:pStyle w:val="Compact"/>
       </w:pPr>
       <w:r>
-        <w:t xml:space="preserve">One model update rejected forced tool choice and broke five tools; keep the fallback and a daily real-call check.</w:t>
+        <w:t xml:space="preserve">Free-form JSON breaks ($ signs, ranges like "50-80"); use forced tools (</w:t>
+      </w:r>
+      <w:r>
+        <w:rPr>
+          <w:rStyle w:val="VerbatimChar"/>
+        </w:rPr>
+        <w:t xml:space="preserve">askWithTool</w:t>
+      </w:r>
+      <w:r>
+        <w:t xml:space="preserve">).</w:t>
       </w:r>
     </w:p>
     <w:p>
@@ -50565,19 +52777,7 @@
         <w:pStyle w:val="Compact"/>
       </w:pPr>
       <w:r>
-        <w:t xml:space="preserve">Bigger output means a bigger</w:t>
-      </w:r>
-      <w:r>
-        <w:t xml:space="preserve"> </w:t>
-      </w:r>
-      <w:r>
-        <w:rPr>
-          <w:rStyle w:val="VerbatimChar"/>
-        </w:rPr>
-        <w:t xml:space="preserve">max_tokens</w:t>
-      </w:r>
-      <w:r>
-        <w:t xml:space="preserve">. Adding keywords cut off 9 of 26 listings at 1,200 tokens; now 2,500–9,000 plus the cutoff tripwire.</w:t>
+        <w:t xml:space="preserve">One model update rejected forced tool choice and broke five tools; keep the fallback and a daily real-call check.</w:t>
       </w:r>
     </w:p>
     <w:p>
@@ -50589,23 +52789,19 @@
         <w:pStyle w:val="Compact"/>
       </w:pPr>
       <w:r>
-        <w:t xml:space="preserve">The model ignores "don't include X."</w:t>
-      </w:r>
-      <w:r>
-        <w:t xml:space="preserve"> </w:t>
-      </w:r>
-      <w:r>
-        <w:rPr>
-          <w:bCs/>
-          <w:b/>
-        </w:rPr>
-        <w:t xml:space="preserve">Clean the output in code</w:t>
-      </w:r>
-      <w:r>
-        <w:t xml:space="preserve"> </w:t>
-      </w:r>
-      <w:r>
-        <w:t xml:space="preserve">(the price-talk scrubber).</w:t>
+        <w:t xml:space="preserve">Bigger output means a bigger</w:t>
+      </w:r>
+      <w:r>
+        <w:t xml:space="preserve"> </w:t>
+      </w:r>
+      <w:r>
+        <w:rPr>
+          <w:rStyle w:val="VerbatimChar"/>
+        </w:rPr>
+        <w:t xml:space="preserve">max_tokens</w:t>
+      </w:r>
+      <w:r>
+        <w:t xml:space="preserve">. Adding keywords cut off 9 of 26 listings at 1,200 tokens; now 2,500–9,000 plus the cutoff tripwire.</w:t>
       </w:r>
     </w:p>
     <w:p>
@@ -50617,7 +52813,23 @@
         <w:pStyle w:val="Compact"/>
       </w:pPr>
       <w:r>
-        <w:t xml:space="preserve">Prompt caching only pays if calls come within 5 minutes; sending only the relevant guide sections was cheaper.</w:t>
+        <w:t xml:space="preserve">The model ignores "don't include X."</w:t>
+      </w:r>
+      <w:r>
+        <w:t xml:space="preserve"> </w:t>
+      </w:r>
+      <w:r>
+        <w:rPr>
+          <w:bCs/>
+          <w:b/>
+        </w:rPr>
+        <w:t xml:space="preserve">Clean the output in code</w:t>
+      </w:r>
+      <w:r>
+        <w:t xml:space="preserve"> </w:t>
+      </w:r>
+      <w:r>
+        <w:t xml:space="preserve">(the price-talk scrubber).</w:t>
       </w:r>
     </w:p>
     <w:p>
@@ -50629,6 +52841,18 @@
         <w:pStyle w:val="Compact"/>
       </w:pPr>
       <w:r>
+        <w:t xml:space="preserve">Prompt caching only pays if calls come within 5 minutes; sending only the relevant guide sections was cheaper.</w:t>
+      </w:r>
+    </w:p>
+    <w:p>
+      <w:pPr>
+        <w:numPr>
+          <w:ilvl w:val="0"/>
+          <w:numId w:val="1053"/>
+        </w:numPr>
+        <w:pStyle w:val="Compact"/>
+      </w:pPr>
+      <w:r>
         <w:t xml:space="preserve">Haiku was too thin for rewriting; Sonnet for quality, Haiku for quick help.</w:t>
       </w:r>
     </w:p>
@@ -53086,6 +55310,112 @@
       </w:r>
       <w:r>
         <w:t xml:space="preserve">The slot is released on failure and retried at :20 and :40 (from PP-T7).</w:t>
+      </w:r>
+    </w:p>
+    <w:p>
+      <w:pPr>
+        <w:numPr>
+          <w:ilvl w:val="0"/>
+          <w:numId w:val="1064"/>
+        </w:numPr>
+        <w:pStyle w:val="Compact"/>
+      </w:pPr>
+      <w:r>
+        <w:rPr>
+          <w:bCs/>
+          <w:b/>
+        </w:rPr>
+        <w:t xml:space="preserve">T-57. The AI account ran out of prepaid credit (Oct 9).</w:t>
+      </w:r>
+      <w:r>
+        <w:t xml:space="preserve"> </w:t>
+      </w:r>
+      <w:r>
+        <w:t xml:space="preserve">Every AI tool stopped, and customers were told "try a clearer photo," which blamed them for an outage. The daily health check caught it and texted the owner at 9:24 AM.</w:t>
+      </w:r>
+      <w:r>
+        <w:t xml:space="preserve"> </w:t>
+      </w:r>
+      <w:r>
+        <w:rPr>
+          <w:bCs/>
+          <w:b/>
+        </w:rPr>
+        <w:t xml:space="preserve">Fix:</w:t>
+      </w:r>
+      <w:r>
+        <w:t xml:space="preserve"> </w:t>
+      </w:r>
+      <w:r>
+        <w:rPr>
+          <w:rStyle w:val="VerbatimChar"/>
+        </w:rPr>
+        <w:t xml:space="preserve">aiServiceDown()</w:t>
+      </w:r>
+      <w:r>
+        <w:t xml:space="preserve"> </w:t>
+      </w:r>
+      <w:r>
+        <w:t xml:space="preserve">and</w:t>
+      </w:r>
+      <w:r>
+        <w:t xml:space="preserve"> </w:t>
+      </w:r>
+      <w:r>
+        <w:rPr>
+          <w:rStyle w:val="VerbatimChar"/>
+        </w:rPr>
+        <w:t xml:space="preserve">reportAiDown()</w:t>
+      </w:r>
+      <w:r>
+        <w:t xml:space="preserve"> </w:t>
+      </w:r>
+      <w:r>
+        <w:t xml:space="preserve">in</w:t>
+      </w:r>
+      <w:r>
+        <w:t xml:space="preserve"> </w:t>
+      </w:r>
+      <w:r>
+        <w:rPr>
+          <w:rStyle w:val="VerbatimChar"/>
+        </w:rPr>
+        <w:t xml:space="preserve">src/lib/ai-tool.ts</w:t>
+      </w:r>
+      <w:r>
+        <w:t xml:space="preserve">. Out of credit, bad key, rate limit or overload now shows "Our AI is taking a short break. Nothing was used or charged," and texts the owner immediately, at most once an hour.</w:t>
+      </w:r>
+      <w:r>
+        <w:t xml:space="preserve"> </w:t>
+      </w:r>
+      <w:r>
+        <w:rPr>
+          <w:bCs/>
+          <w:b/>
+        </w:rPr>
+        <w:t xml:space="preserve">Rule:</w:t>
+      </w:r>
+      <w:r>
+        <w:t xml:space="preserve"> </w:t>
+      </w:r>
+      <w:r>
+        <w:t xml:space="preserve">tell customers the truth about outages; turn on</w:t>
+      </w:r>
+      <w:r>
+        <w:t xml:space="preserve"> </w:t>
+      </w:r>
+      <w:r>
+        <w:rPr>
+          <w:bCs/>
+          <w:b/>
+        </w:rPr>
+        <w:t xml:space="preserve">auto-reload</w:t>
+      </w:r>
+      <w:r>
+        <w:t xml:space="preserve"> </w:t>
+      </w:r>
+      <w:r>
+        <w:t xml:space="preserve">for any prepaid service on day zero.</w:t>
       </w:r>
     </w:p>
     <w:p>

</xml_diff>

<commit_message>
Records: promo reel, playbook note
Co-Authored-By: Claude Opus 5.5 <noreply@anthropic.com>
Claude-Session: https://claude.ai/code/session_01JPZJaTbXQFN2qiYRf4rkZK
</commit_message>
<xml_diff>
--- a/docs/Next_Owner_Market_App_Builder_Playbook.docx
+++ b/docs/Next_Owner_Market_App_Builder_Playbook.docx
@@ -55652,6 +55652,67 @@
       </w:pPr>
       <w:r>
         <w:t xml:space="preserve">Tell the owner to keep selling while it's being built.</w:t>
+      </w:r>
+    </w:p>
+    <w:p>
+      <w:pPr>
+        <w:numPr>
+          <w:ilvl w:val="0"/>
+          <w:numId w:val="1065"/>
+        </w:numPr>
+        <w:pStyle w:val="Compact"/>
+      </w:pPr>
+      <w:r>
+        <w:rPr>
+          <w:bCs/>
+          <w:b/>
+        </w:rPr>
+        <w:t xml:space="preserve">Promo videos for $0, built from code (Oct 9).</w:t>
+      </w:r>
+      <w:r>
+        <w:t xml:space="preserve"> </w:t>
+      </w:r>
+      <w:r>
+        <w:t xml:space="preserve">One HTML page holds the whole video, with a</w:t>
+      </w:r>
+      <w:r>
+        <w:t xml:space="preserve"> </w:t>
+      </w:r>
+      <w:r>
+        <w:rPr>
+          <w:rStyle w:val="VerbatimChar"/>
+        </w:rPr>
+        <w:t xml:space="preserve">render(t)</w:t>
+      </w:r>
+      <w:r>
+        <w:t xml:space="preserve"> </w:t>
+      </w:r>
+      <w:r>
+        <w:t xml:space="preserve">function that draws second</w:t>
+      </w:r>
+      <w:r>
+        <w:t xml:space="preserve"> </w:t>
+      </w:r>
+      <w:r>
+        <w:rPr>
+          <w:rStyle w:val="VerbatimChar"/>
+        </w:rPr>
+        <w:t xml:space="preserve">t</w:t>
+      </w:r>
+      <w:r>
+        <w:t xml:space="preserve">. Playwright screenshots 30 frames a second and ffmpeg joins them into a vertical 1080×1920 MP4. Use the owner's real photos and real AI results, big captions (most people watch muted), and keep key text out of the bottom quarter, where the Reels buttons sit. Source and rebuild steps:</w:t>
+      </w:r>
+      <w:r>
+        <w:t xml:space="preserve"> </w:t>
+      </w:r>
+      <w:r>
+        <w:rPr>
+          <w:rStyle w:val="VerbatimChar"/>
+        </w:rPr>
+        <w:t xml:space="preserve">docs/ads/source/</w:t>
+      </w:r>
+      <w:r>
+        <w:t xml:space="preserve">. The first one (a 26-second "What's it worth?" reel) took about 1 minute to render.</w:t>
       </w:r>
     </w:p>
     <w:p>

</xml_diff>

<commit_message>
Records: Share this find restored; playbook T-58
Co-Authored-By: Claude Opus 5.5 <noreply@anthropic.com>
Claude-Session: https://claude.ai/code/session_01JPZJaTbXQFN2qiYRf4rkZK
</commit_message>
<xml_diff>
--- a/docs/Next_Owner_Market_App_Builder_Playbook.docx
+++ b/docs/Next_Owner_Market_App_Builder_Playbook.docx
@@ -55416,6 +55416,60 @@
       </w:r>
       <w:r>
         <w:t xml:space="preserve">for any prepaid service on day zero.</w:t>
+      </w:r>
+    </w:p>
+    <w:p>
+      <w:pPr>
+        <w:numPr>
+          <w:ilvl w:val="0"/>
+          <w:numId w:val="1064"/>
+        </w:numPr>
+        <w:pStyle w:val="Compact"/>
+      </w:pPr>
+      <w:r>
+        <w:rPr>
+          <w:bCs/>
+          <w:b/>
+        </w:rPr>
+        <w:t xml:space="preserve">T-58. A merged button hid a feature the owner used (Oct 9).</w:t>
+      </w:r>
+      <w:r>
+        <w:t xml:space="preserve"> </w:t>
+      </w:r>
+      <w:r>
+        <w:t xml:space="preserve">The new 📤 Share button also made the find's page on our site, so the separate "📣 Share this find" box was removed. To the owner, his "put it on our site" step was simply gone.</w:t>
+      </w:r>
+      <w:r>
+        <w:t xml:space="preserve"> </w:t>
+      </w:r>
+      <w:r>
+        <w:rPr>
+          <w:bCs/>
+          <w:b/>
+        </w:rPr>
+        <w:t xml:space="preserve">Fix:</w:t>
+      </w:r>
+      <w:r>
+        <w:t xml:space="preserve"> </w:t>
+      </w:r>
+      <w:r>
+        <w:t xml:space="preserve">both buttons are back, sharing one page, so there are no duplicates.</w:t>
+      </w:r>
+      <w:r>
+        <w:t xml:space="preserve"> </w:t>
+      </w:r>
+      <w:r>
+        <w:rPr>
+          <w:bCs/>
+          <w:b/>
+        </w:rPr>
+        <w:t xml:space="preserve">Rule:</w:t>
+      </w:r>
+      <w:r>
+        <w:t xml:space="preserve"> </w:t>
+      </w:r>
+      <w:r>
+        <w:t xml:space="preserve">when combining features, keep every step the owner can see and name, unless he says to drop it.</w:t>
       </w:r>
     </w:p>
     <w:p>

</xml_diff>

<commit_message>
Rules: locked layout for lookup answer screens (owner, Oct 9); playbook T-59
Co-Authored-By: Claude Opus 5.5 <noreply@anthropic.com>
Claude-Session: https://claude.ai/code/session_01JPZJaTbXQFN2qiYRf4rkZK
</commit_message>
<xml_diff>
--- a/docs/Next_Owner_Market_App_Builder_Playbook.docx
+++ b/docs/Next_Owner_Market_App_Builder_Playbook.docx
@@ -55485,6 +55485,54 @@
           <w:bCs/>
           <w:b/>
         </w:rPr>
+        <w:t xml:space="preserve">T-59. A restored feature went back to its old spot, not the spot the owner had fought for (Oct 9).</w:t>
+      </w:r>
+      <w:r>
+        <w:t xml:space="preserve"> </w:t>
+      </w:r>
+      <w:r>
+        <w:t xml:space="preserve">"Share this find" came back at the bottom of the page, two days after he got it moved to the top.</w:t>
+      </w:r>
+      <w:r>
+        <w:t xml:space="preserve"> </w:t>
+      </w:r>
+      <w:r>
+        <w:rPr>
+          <w:iCs/>
+          <w:i/>
+        </w:rPr>
+        <w:t xml:space="preserve">"I ask you to change one thing and you change a fucking other thing."</w:t>
+      </w:r>
+      <w:r>
+        <w:t xml:space="preserve"> </w:t>
+      </w:r>
+      <w:r>
+        <w:rPr>
+          <w:bCs/>
+          <w:b/>
+        </w:rPr>
+        <w:t xml:space="preserve">Rule:</w:t>
+      </w:r>
+      <w:r>
+        <w:t xml:space="preserve"> </w:t>
+      </w:r>
+      <w:r>
+        <w:t xml:space="preserve">layouts the owner has settled are written down as LOCKED in CLAUDE.md, and anything brought back goes where he last asked for it.</w:t>
+      </w:r>
+    </w:p>
+    <w:p>
+      <w:pPr>
+        <w:numPr>
+          <w:ilvl w:val="0"/>
+          <w:numId w:val="1064"/>
+        </w:numPr>
+        <w:pStyle w:val="Compact"/>
+      </w:pPr>
+      <w:r>
+        <w:rPr>
+          <w:bCs/>
+          <w:b/>
+        </w:rPr>
         <w:t xml:space="preserve">The political app's own trial and error</w:t>
       </w:r>
       <w:r>
@@ -59814,6 +59862,54 @@
           <w:rStyle w:val="NormalTok"/>
         </w:rPr>
         <w:t xml:space="preserve">.</w:t>
+      </w:r>
+      <w:r>
+        <w:br/>
+      </w:r>
+      <w:r>
+        <w:br/>
+      </w:r>
+      <w:r>
+        <w:rPr>
+          <w:rStyle w:val="SpecialStringTok"/>
+        </w:rPr>
+        <w:t xml:space="preserve">23. </w:t>
+      </w:r>
+      <w:r>
+        <w:rPr>
+          <w:rStyle w:val="NormalTok"/>
+        </w:rPr>
+        <w:t xml:space="preserve">**Locked layouts (Oct 9, 2026).**</w:t>
+      </w:r>
+      <w:r>
+        <w:br/>
+      </w:r>
+      <w:r>
+        <w:rPr>
+          <w:rStyle w:val="SpecialStringTok"/>
+        </w:rPr>
+        <w:t xml:space="preserve">    - </w:t>
+      </w:r>
+      <w:r>
+        <w:rPr>
+          <w:rStyle w:val="NormalTok"/>
+        </w:rPr>
+        <w:t xml:space="preserve">Once the owner settles where something goes, it's written down as LOCKED in CLAUDE.md and never moved without his say.</w:t>
+      </w:r>
+      <w:r>
+        <w:br/>
+      </w:r>
+      <w:r>
+        <w:rPr>
+          <w:rStyle w:val="SpecialStringTok"/>
+        </w:rPr>
+        <w:t xml:space="preserve">    - </w:t>
+      </w:r>
+      <w:r>
+        <w:rPr>
+          <w:rStyle w:val="NormalTok"/>
+        </w:rPr>
+        <w:t xml:space="preserve">Anything brought back goes where he last asked for it.</w:t>
       </w:r>
       <w:r>
         <w:br/>

</xml_diff>

<commit_message>
Records: journal, change log, guides, playbook, marketing plan (Find it for less)
Co-Authored-By: Claude Opus 5.5 <noreply@anthropic.com>
Claude-Session: https://claude.ai/code/session_01JPZJaTbXQFN2qiYRf4rkZK
</commit_message>
<xml_diff>
--- a/docs/Next_Owner_Market_App_Builder_Playbook.docx
+++ b/docs/Next_Owner_Market_App_Builder_Playbook.docx
@@ -11449,7 +11449,7 @@
           <w:iCs/>
           <w:i/>
         </w:rPr>
-        <w:t xml:space="preserve">src/lib/automations.ts, lines 630-660</w:t>
+        <w:t xml:space="preserve">src/lib/automations.ts, lines 632-662</w:t>
       </w:r>
     </w:p>
     <w:p>
@@ -17472,7 +17472,7 @@
           <w:iCs/>
           <w:i/>
         </w:rPr>
-        <w:t xml:space="preserve">src/lib/automations.ts, lines 737-757</w:t>
+        <w:t xml:space="preserve">src/lib/automations.ts, lines 739-759</w:t>
       </w:r>
     </w:p>
     <w:p>
@@ -45303,6 +45303,222 @@
       </w:r>
       <w:r>
         <w:rPr>
+          <w:rStyle w:val="CommentTok"/>
+        </w:rPr>
+        <w:t xml:space="preserve">// web searches (Find it for less) are $10 per 1,000 on top of tokens</w:t>
+      </w:r>
+      <w:r>
+        <w:br/>
+      </w:r>
+      <w:r>
+        <w:rPr>
+          <w:rStyle w:val="NormalTok"/>
+        </w:rPr>
+        <w:t xml:space="preserve">  </w:t>
+      </w:r>
+      <w:r>
+        <w:rPr>
+          <w:rStyle w:val="KeywordTok"/>
+        </w:rPr>
+        <w:t xml:space="preserve">const</w:t>
+      </w:r>
+      <w:r>
+        <w:rPr>
+          <w:rStyle w:val="NormalTok"/>
+        </w:rPr>
+        <w:t xml:space="preserve"> searches </w:t>
+      </w:r>
+      <w:r>
+        <w:rPr>
+          <w:rStyle w:val="OperatorTok"/>
+        </w:rPr>
+        <w:t xml:space="preserve">=</w:t>
+      </w:r>
+      <w:r>
+        <w:rPr>
+          <w:rStyle w:val="NormalTok"/>
+        </w:rPr>
+        <w:t xml:space="preserve"> </w:t>
+      </w:r>
+      <w:r>
+        <w:rPr>
+          <w:rStyle w:val="BuiltInTok"/>
+        </w:rPr>
+        <w:t xml:space="preserve">Number</w:t>
+      </w:r>
+      <w:r>
+        <w:rPr>
+          <w:rStyle w:val="NormalTok"/>
+        </w:rPr>
+        <w:t xml:space="preserve">((u </w:t>
+      </w:r>
+      <w:r>
+        <w:rPr>
+          <w:rStyle w:val="ImportTok"/>
+        </w:rPr>
+        <w:t xml:space="preserve">as</w:t>
+      </w:r>
+      <w:r>
+        <w:rPr>
+          <w:rStyle w:val="NormalTok"/>
+        </w:rPr>
+        <w:t xml:space="preserve"> { server_tool_use</w:t>
+      </w:r>
+      <w:r>
+        <w:rPr>
+          <w:rStyle w:val="OperatorTok"/>
+        </w:rPr>
+        <w:t xml:space="preserve">?:</w:t>
+      </w:r>
+      <w:r>
+        <w:rPr>
+          <w:rStyle w:val="NormalTok"/>
+        </w:rPr>
+        <w:t xml:space="preserve"> { web_search_requests</w:t>
+      </w:r>
+      <w:r>
+        <w:rPr>
+          <w:rStyle w:val="OperatorTok"/>
+        </w:rPr>
+        <w:t xml:space="preserve">?:</w:t>
+      </w:r>
+      <w:r>
+        <w:rPr>
+          <w:rStyle w:val="NormalTok"/>
+        </w:rPr>
+        <w:t xml:space="preserve"> </w:t>
+      </w:r>
+      <w:r>
+        <w:rPr>
+          <w:rStyle w:val="DataTypeTok"/>
+        </w:rPr>
+        <w:t xml:space="preserve">number</w:t>
+      </w:r>
+      <w:r>
+        <w:rPr>
+          <w:rStyle w:val="NormalTok"/>
+        </w:rPr>
+        <w:t xml:space="preserve"> } } </w:t>
+      </w:r>
+      <w:r>
+        <w:rPr>
+          <w:rStyle w:val="OperatorTok"/>
+        </w:rPr>
+        <w:t xml:space="preserve">|</w:t>
+      </w:r>
+      <w:r>
+        <w:rPr>
+          <w:rStyle w:val="NormalTok"/>
+        </w:rPr>
+        <w:t xml:space="preserve"> </w:t>
+      </w:r>
+      <w:r>
+        <w:rPr>
+          <w:rStyle w:val="DataTypeTok"/>
+        </w:rPr>
+        <w:t xml:space="preserve">null</w:t>
+      </w:r>
+      <w:r>
+        <w:rPr>
+          <w:rStyle w:val="NormalTok"/>
+        </w:rPr>
+        <w:t xml:space="preserve"> </w:t>
+      </w:r>
+      <w:r>
+        <w:rPr>
+          <w:rStyle w:val="OperatorTok"/>
+        </w:rPr>
+        <w:t xml:space="preserve">|</w:t>
+      </w:r>
+      <w:r>
+        <w:rPr>
+          <w:rStyle w:val="NormalTok"/>
+        </w:rPr>
+        <w:t xml:space="preserve"> </w:t>
+      </w:r>
+      <w:r>
+        <w:rPr>
+          <w:rStyle w:val="DataTypeTok"/>
+        </w:rPr>
+        <w:t xml:space="preserve">undefined</w:t>
+      </w:r>
+      <w:r>
+        <w:rPr>
+          <w:rStyle w:val="NormalTok"/>
+        </w:rPr>
+        <w:t xml:space="preserve">)</w:t>
+      </w:r>
+      <w:r>
+        <w:rPr>
+          <w:rStyle w:val="OperatorTok"/>
+        </w:rPr>
+        <w:t xml:space="preserve">?.</w:t>
+      </w:r>
+      <w:r>
+        <w:rPr>
+          <w:rStyle w:val="AttributeTok"/>
+        </w:rPr>
+        <w:t xml:space="preserve">server_tool_use</w:t>
+      </w:r>
+      <w:r>
+        <w:rPr>
+          <w:rStyle w:val="OperatorTok"/>
+        </w:rPr>
+        <w:t xml:space="preserve">?.</w:t>
+      </w:r>
+      <w:r>
+        <w:rPr>
+          <w:rStyle w:val="AttributeTok"/>
+        </w:rPr>
+        <w:t xml:space="preserve">web_search_requests</w:t>
+      </w:r>
+      <w:r>
+        <w:rPr>
+          <w:rStyle w:val="NormalTok"/>
+        </w:rPr>
+        <w:t xml:space="preserve"> </w:t>
+      </w:r>
+      <w:r>
+        <w:rPr>
+          <w:rStyle w:val="OperatorTok"/>
+        </w:rPr>
+        <w:t xml:space="preserve">||</w:t>
+      </w:r>
+      <w:r>
+        <w:rPr>
+          <w:rStyle w:val="NormalTok"/>
+        </w:rPr>
+        <w:t xml:space="preserve"> </w:t>
+      </w:r>
+      <w:r>
+        <w:rPr>
+          <w:rStyle w:val="DecValTok"/>
+        </w:rPr>
+        <w:t xml:space="preserve">0</w:t>
+      </w:r>
+      <w:r>
+        <w:rPr>
+          <w:rStyle w:val="NormalTok"/>
+        </w:rPr>
+        <w:t xml:space="preserve">)</w:t>
+      </w:r>
+      <w:r>
+        <w:rPr>
+          <w:rStyle w:val="OperatorTok"/>
+        </w:rPr>
+        <w:t xml:space="preserve">;</w:t>
+      </w:r>
+      <w:r>
+        <w:br/>
+      </w:r>
+      <w:r>
+        <w:rPr>
+          <w:rStyle w:val="NormalTok"/>
+        </w:rPr>
+        <w:t xml:space="preserve">  </w:t>
+      </w:r>
+      <w:r>
+        <w:rPr>
           <w:rStyle w:val="ControlFlowTok"/>
         </w:rPr>
         <w:t xml:space="preserve">return</w:t>
@@ -45537,6 +45753,42 @@
       </w:r>
       <w:r>
         <w:rPr>
+          <w:rStyle w:val="NormalTok"/>
+        </w:rPr>
+        <w:t xml:space="preserve"> </w:t>
+      </w:r>
+      <w:r>
+        <w:rPr>
+          <w:rStyle w:val="OperatorTok"/>
+        </w:rPr>
+        <w:t xml:space="preserve">+</w:t>
+      </w:r>
+      <w:r>
+        <w:rPr>
+          <w:rStyle w:val="NormalTok"/>
+        </w:rPr>
+        <w:t xml:space="preserve"> searches </w:t>
+      </w:r>
+      <w:r>
+        <w:rPr>
+          <w:rStyle w:val="OperatorTok"/>
+        </w:rPr>
+        <w:t xml:space="preserve">*</w:t>
+      </w:r>
+      <w:r>
+        <w:rPr>
+          <w:rStyle w:val="NormalTok"/>
+        </w:rPr>
+        <w:t xml:space="preserve"> </w:t>
+      </w:r>
+      <w:r>
+        <w:rPr>
+          <w:rStyle w:val="FloatTok"/>
+        </w:rPr>
+        <w:t xml:space="preserve">0.01</w:t>
+      </w:r>
+      <w:r>
+        <w:rPr>
           <w:rStyle w:val="OperatorTok"/>
         </w:rPr>
         <w:t xml:space="preserve">;</w:t>
@@ -46431,48 +46683,6 @@
           <w:rStyle w:val="OperatorTok"/>
         </w:rPr>
         <w:t xml:space="preserve">;</w:t>
-      </w:r>
-      <w:r>
-        <w:br/>
-      </w:r>
-      <w:r>
-        <w:rPr>
-          <w:rStyle w:val="NormalTok"/>
-        </w:rPr>
-        <w:t xml:space="preserve">  } </w:t>
-      </w:r>
-      <w:r>
-        <w:rPr>
-          <w:rStyle w:val="ControlFlowTok"/>
-        </w:rPr>
-        <w:t xml:space="preserve">catch</w:t>
-      </w:r>
-      <w:r>
-        <w:rPr>
-          <w:rStyle w:val="NormalTok"/>
-        </w:rPr>
-        <w:t xml:space="preserve"> { </w:t>
-      </w:r>
-      <w:r>
-        <w:rPr>
-          <w:rStyle w:val="CommentTok"/>
-        </w:rPr>
-        <w:t xml:space="preserve">/* logging must never break a lookup */</w:t>
-      </w:r>
-      <w:r>
-        <w:rPr>
-          <w:rStyle w:val="NormalTok"/>
-        </w:rPr>
-        <w:t xml:space="preserve"> }</w:t>
-      </w:r>
-      <w:r>
-        <w:br/>
-      </w:r>
-      <w:r>
-        <w:rPr>
-          <w:rStyle w:val="NormalTok"/>
-        </w:rPr>
-        <w:t xml:space="preserve">}</w:t>
       </w:r>
     </w:p>
     <w:p>
@@ -48315,6 +48525,162 @@
                 <w:bCs/>
                 <w:b/>
               </w:rPr>
+              <w:t xml:space="preserve">Anthropic web search</w:t>
+            </w:r>
+            <w:r>
+              <w:t xml:space="preserve"> </w:t>
+            </w:r>
+            <w:r>
+              <w:t xml:space="preserve">(live prices for Find it for less)</w:t>
+            </w:r>
+          </w:p>
+        </w:tc>
+        <w:tc>
+          <w:tcPr/>
+          <w:p>
+            <w:pPr>
+              <w:pStyle w:val="Compact"/>
+              <w:jc w:val="left"/>
+            </w:pPr>
+            <w:r>
+              <w:t xml:space="preserve">Searches stores right now so prices and links are real</w:t>
+            </w:r>
+          </w:p>
+        </w:tc>
+        <w:tc>
+          <w:tcPr/>
+          <w:p>
+            <w:pPr>
+              <w:pStyle w:val="Compact"/>
+              <w:jc w:val="left"/>
+            </w:pPr>
+            <w:r>
+              <w:t xml:space="preserve">A server tool in the same Messages call:</w:t>
+            </w:r>
+            <w:r>
+              <w:t xml:space="preserve"> </w:t>
+            </w:r>
+            <w:r>
+              <w:rPr>
+                <w:rStyle w:val="VerbatimChar"/>
+              </w:rPr>
+              <w:t xml:space="preserve">{type: "web_search_20250305", name: "web_search", max_uses: 5, user_location: {type: "approximate", country: "US"}}</w:t>
+            </w:r>
+            <w:r>
+              <w:t xml:space="preserve">, plus our own</w:t>
+            </w:r>
+            <w:r>
+              <w:t xml:space="preserve"> </w:t>
+            </w:r>
+            <w:r>
+              <w:rPr>
+                <w:rStyle w:val="VerbatimChar"/>
+              </w:rPr>
+              <w:t xml:space="preserve">record_results</w:t>
+            </w:r>
+            <w:r>
+              <w:t xml:space="preserve"> </w:t>
+            </w:r>
+            <w:r>
+              <w:t xml:space="preserve">tool</w:t>
+            </w:r>
+          </w:p>
+        </w:tc>
+        <w:tc>
+          <w:tcPr/>
+          <w:p>
+            <w:pPr>
+              <w:pStyle w:val="Compact"/>
+              <w:jc w:val="left"/>
+            </w:pPr>
+            <w:r>
+              <w:t xml:space="preserve">Tested from the sandbox (api.anthropic.com is reachable) on real examples before building screens</w:t>
+            </w:r>
+          </w:p>
+        </w:tc>
+        <w:tc>
+          <w:tcPr/>
+          <w:p>
+            <w:pPr>
+              <w:pStyle w:val="Compact"/>
+              <w:jc w:val="left"/>
+            </w:pPr>
+            <w:r>
+              <w:t xml:space="preserve">Handle</w:t>
+            </w:r>
+            <w:r>
+              <w:t xml:space="preserve"> </w:t>
+            </w:r>
+            <w:r>
+              <w:rPr>
+                <w:rStyle w:val="VerbatimChar"/>
+              </w:rPr>
+              <w:t xml:space="preserve">stop_reason: "pause_turn"</w:t>
+            </w:r>
+            <w:r>
+              <w:t xml:space="preserve"> </w:t>
+            </w:r>
+            <w:r>
+              <w:t xml:space="preserve">by sending the assistant turn back; read</w:t>
+            </w:r>
+            <w:r>
+              <w:t xml:space="preserve"> </w:t>
+            </w:r>
+            <w:r>
+              <w:rPr>
+                <w:rStyle w:val="VerbatimChar"/>
+              </w:rPr>
+              <w:t xml:space="preserve">usage.server_tool_use.web_search_requests</w:t>
+            </w:r>
+            <w:r>
+              <w:t xml:space="preserve"> </w:t>
+            </w:r>
+            <w:r>
+              <w:t xml:space="preserve">to log cost; keep only URLs that appeared in</w:t>
+            </w:r>
+            <w:r>
+              <w:t xml:space="preserve"> </w:t>
+            </w:r>
+            <w:r>
+              <w:rPr>
+                <w:rStyle w:val="VerbatimChar"/>
+              </w:rPr>
+              <w:t xml:space="preserve">web_search_tool_result</w:t>
+            </w:r>
+            <w:r>
+              <w:t xml:space="preserve"> </w:t>
+            </w:r>
+            <w:r>
+              <w:t xml:space="preserve">blocks. Amazon's Product API needs 3 sales in 30 days first, so live search is the way in.</w:t>
+            </w:r>
+          </w:p>
+        </w:tc>
+        <w:tc>
+          <w:tcPr/>
+          <w:p>
+            <w:pPr>
+              <w:pStyle w:val="Compact"/>
+              <w:jc w:val="left"/>
+            </w:pPr>
+            <w:r>
+              <w:t xml:space="preserve">$10 per 1,000 searches plus tokens (about 10 to 15 cents a find)</w:t>
+            </w:r>
+          </w:p>
+        </w:tc>
+      </w:tr>
+      <w:tr>
+        <w:tc>
+          <w:tcPr/>
+          <w:p>
+            <w:pPr>
+              <w:pStyle w:val="Compact"/>
+              <w:jc w:val="left"/>
+            </w:pPr>
+            <w:r>
+              <w:rPr>
+                <w:bCs/>
+                <w:b/>
+              </w:rPr>
               <w:t xml:space="preserve">Anthropic</w:t>
             </w:r>
             <w:r>
@@ -55518,6 +55884,135 @@
       </w:r>
       <w:r>
         <w:t xml:space="preserve">layouts the owner has settled are written down as LOCKED in CLAUDE.md, and anything brought back goes where he last asked for it.</w:t>
+      </w:r>
+    </w:p>
+    <w:p>
+      <w:pPr>
+        <w:numPr>
+          <w:ilvl w:val="0"/>
+          <w:numId w:val="1064"/>
+        </w:numPr>
+        <w:pStyle w:val="Compact"/>
+      </w:pPr>
+      <w:r>
+        <w:rPr>
+          <w:bCs/>
+          <w:b/>
+        </w:rPr>
+        <w:t xml:space="preserve">T-60. Live prices without making up links (Oct 9).</w:t>
+      </w:r>
+      <w:r>
+        <w:t xml:space="preserve"> </w:t>
+      </w:r>
+      <w:r>
+        <w:t xml:space="preserve">An AI asked for "the cheapest place to buy X" will happily write product URLs that look right and don't exist.</w:t>
+      </w:r>
+      <w:r>
+        <w:t xml:space="preserve"> </w:t>
+      </w:r>
+      <w:r>
+        <w:rPr>
+          <w:bCs/>
+          <w:b/>
+        </w:rPr>
+        <w:t xml:space="preserve">Fix:</w:t>
+      </w:r>
+      <w:r>
+        <w:t xml:space="preserve"> </w:t>
+      </w:r>
+      <w:r>
+        <w:t xml:space="preserve">Find it for less uses Anthropic's web search tool and collects every URL the searches actually returned; a product link is kept only if it is one of those, otherwise the button becomes a search at that store. Also: the search results make each call cost 10 to 15 cents (mostly input tokens, plus $10 per 1,000 searches), so the free cap for signed-out visitors is lower than the photo tools.</w:t>
+      </w:r>
+      <w:r>
+        <w:t xml:space="preserve"> </w:t>
+      </w:r>
+      <w:r>
+        <w:rPr>
+          <w:bCs/>
+          <w:b/>
+        </w:rPr>
+        <w:t xml:space="preserve">Rule:</w:t>
+      </w:r>
+      <w:r>
+        <w:t xml:space="preserve"> </w:t>
+      </w:r>
+      <w:r>
+        <w:t xml:space="preserve">never show an AI-written URL the code hasn't seen come back from a real search; count server-tool fees in your cost log from day one.</w:t>
+      </w:r>
+    </w:p>
+    <w:p>
+      <w:pPr>
+        <w:numPr>
+          <w:ilvl w:val="0"/>
+          <w:numId w:val="1064"/>
+        </w:numPr>
+        <w:pStyle w:val="Compact"/>
+      </w:pPr>
+      <w:r>
+        <w:rPr>
+          <w:bCs/>
+          <w:b/>
+        </w:rPr>
+        <w:t xml:space="preserve">T-61. A long tool answer came back tangled (Oct 9).</w:t>
+      </w:r>
+      <w:r>
+        <w:t xml:space="preserve"> </w:t>
+      </w:r>
+      <w:r>
+        <w:t xml:space="preserve">With live web search plus a big nested answer schema, about 1 in 4 finds came back with empty lists, fields flattened out of their box, or bits of tool markup inside the text, and one test on the live site showed a result with no stores at all.</w:t>
+      </w:r>
+      <w:r>
+        <w:t xml:space="preserve"> </w:t>
+      </w:r>
+      <w:r>
+        <w:rPr>
+          <w:bCs/>
+          <w:b/>
+        </w:rPr>
+        <w:t xml:space="preserve">Fix:</w:t>
+      </w:r>
+      <w:r>
+        <w:t xml:space="preserve"> </w:t>
+      </w:r>
+      <w:r>
+        <w:rPr>
+          <w:rStyle w:val="VerbatimChar"/>
+        </w:rPr>
+        <w:t xml:space="preserve">strict: true</w:t>
+      </w:r>
+      <w:r>
+        <w:t xml:space="preserve"> </w:t>
+      </w:r>
+      <w:r>
+        <w:t xml:space="preserve">on the answer tool (the API then guarantees the schema; every object closed, every field required, list lengths trimmed in code), and if the model records twice, keep the fuller one. 8 of 8 live tests clean afterward.</w:t>
+      </w:r>
+      <w:r>
+        <w:t xml:space="preserve"> </w:t>
+      </w:r>
+      <w:r>
+        <w:rPr>
+          <w:bCs/>
+          <w:b/>
+        </w:rPr>
+        <w:t xml:space="preserve">Rule:</w:t>
+      </w:r>
+      <w:r>
+        <w:t xml:space="preserve"> </w:t>
+      </w:r>
+      <w:r>
+        <w:t xml:space="preserve">any AI tool with nested objects gets</w:t>
+      </w:r>
+      <w:r>
+        <w:t xml:space="preserve"> </w:t>
+      </w:r>
+      <w:r>
+        <w:rPr>
+          <w:rStyle w:val="VerbatimChar"/>
+        </w:rPr>
+        <w:t xml:space="preserve">strict: true</w:t>
+      </w:r>
+      <w:r>
+        <w:t xml:space="preserve">; test 5+ real runs in parallel before calling it done, not one.</w:t>
       </w:r>
     </w:p>
     <w:p>

</xml_diff>

<commit_message>
Rebuilt documents for the Oct 23 zip
Co-Authored-By: Claude Opus 5.5 <noreply@anthropic.com>
Claude-Session: https://claude.ai/code/session_01JPZJaTbXQFN2qiYRf4rkZK
</commit_message>
<xml_diff>
--- a/docs/Next_Owner_Market_App_Builder_Playbook.docx
+++ b/docs/Next_Owner_Market_App_Builder_Playbook.docx
@@ -59596,6 +59596,15 @@
       </w:r>
       <w:r>
         <w:rPr>
+          <w:rStyle w:val="NormalTok"/>
+        </w:rPr>
+        <w:t xml:space="preserve">**Before every first answer, Claude runs this checklist (Oct 23, 2026). No exceptions.**</w:t>
+      </w:r>
+      <w:r>
+        <w:br/>
+      </w:r>
+      <w:r>
+        <w:rPr>
           <w:rStyle w:val="SpecialStringTok"/>
         </w:rPr>
         <w:t xml:space="preserve">1. </w:t>
@@ -59604,6 +59613,54 @@
         <w:rPr>
           <w:rStyle w:val="NormalTok"/>
         </w:rPr>
+        <w:t xml:space="preserve">What is it, and where did it come from (store, brand, plant, app)? If Claude isn't sure what it is, it asks you before naming it.</w:t>
+      </w:r>
+      <w:r>
+        <w:br/>
+      </w:r>
+      <w:r>
+        <w:rPr>
+          <w:rStyle w:val="SpecialStringTok"/>
+        </w:rPr>
+        <w:t xml:space="preserve">2. </w:t>
+      </w:r>
+      <w:r>
+        <w:rPr>
+          <w:rStyle w:val="NormalTok"/>
+        </w:rPr>
+        <w:t xml:space="preserve">Search the source first. Nothing found means search again with different words. Never guess, never answer from memory.</w:t>
+      </w:r>
+      <w:r>
+        <w:br/>
+      </w:r>
+      <w:r>
+        <w:rPr>
+          <w:rStyle w:val="SpecialStringTok"/>
+        </w:rPr>
+        <w:t xml:space="preserve">3. </w:t>
+      </w:r>
+      <w:r>
+        <w:rPr>
+          <w:rStyle w:val="NormalTok"/>
+        </w:rPr>
+        <w:t xml:space="preserve">Answer once, with the source.</w:t>
+      </w:r>
+      <w:r>
+        <w:br/>
+      </w:r>
+      <w:r>
+        <w:br/>
+      </w:r>
+      <w:r>
+        <w:rPr>
+          <w:rStyle w:val="SpecialStringTok"/>
+        </w:rPr>
+        <w:t xml:space="preserve">1. </w:t>
+      </w:r>
+      <w:r>
+        <w:rPr>
+          <w:rStyle w:val="NormalTok"/>
+        </w:rPr>
         <w:t xml:space="preserve">**Do it yourself.** If a change can be made from Claude's side (code, database, hosting, web addresses, settings), Claude makes it. It sends you into a dashboard only when there is no other way. Then it says so in one line and gives exact copy-paste values and exact taps.</w:t>
       </w:r>
       <w:r>
@@ -60283,6 +60340,21 @@
           <w:rStyle w:val="NormalTok"/>
         </w:rPr>
         <w:t xml:space="preserve">**Send the records after EVERY batch, however small (added Oct 2, 2026).**</w:t>
+      </w:r>
+      <w:r>
+        <w:br/>
+      </w:r>
+      <w:r>
+        <w:rPr>
+          <w:rStyle w:val="SpecialStringTok"/>
+        </w:rPr>
+        <w:t xml:space="preserve">    - </w:t>
+      </w:r>
+      <w:r>
+        <w:rPr>
+          <w:rStyle w:val="NormalTok"/>
+        </w:rPr>
+        <w:t xml:space="preserve">**But never for item lookups or questions (Oct 23, 2026).** A value, a listing, a buyer list or a how-to answer stays in the chat: no zip. A zip goes out only when the app or the documents changed, and several quick changes in a row get ONE zip at the end.</w:t>
       </w:r>
       <w:r>
         <w:br/>

</xml_diff>

<commit_message>
Rebuilt documents for the zip
Co-Authored-By: Claude Opus 5.5 <noreply@anthropic.com>
Claude-Session: https://claude.ai/code/session_01JPZJaTbXQFN2qiYRf4rkZK
</commit_message>
<xml_diff>
--- a/docs/Next_Owner_Market_App_Builder_Playbook.docx
+++ b/docs/Next_Owner_Market_App_Builder_Playbook.docx
@@ -56209,6 +56209,70 @@
       </w:r>
       <w:r>
         <w:t xml:space="preserve">start from what's known about the source (which store, which brand, which plant) and search that first; ask what an item is before naming it from a photo; one search with nothing found means search again with different words, not switch to guessing.</w:t>
+      </w:r>
+    </w:p>
+    <w:p>
+      <w:pPr>
+        <w:numPr>
+          <w:ilvl w:val="0"/>
+          <w:numId w:val="1064"/>
+        </w:numPr>
+        <w:pStyle w:val="Compact"/>
+      </w:pPr>
+      <w:r>
+        <w:rPr>
+          <w:bCs/>
+          <w:b/>
+        </w:rPr>
+        <w:t xml:space="preserve">T-66. A limit stated from memory capped his sales (Oct 23).</w:t>
+      </w:r>
+      <w:r>
+        <w:t xml:space="preserve"> </w:t>
+      </w:r>
+      <w:r>
+        <w:t xml:space="preserve">Claude built the Relist list at 10 a day and said "more than about 20 can get you flagged" without searching. Facebook publishes no daily limit; sellers report 15–30 a day is safe on an established account.</w:t>
+      </w:r>
+      <w:r>
+        <w:t xml:space="preserve"> </w:t>
+      </w:r>
+      <w:r>
+        <w:rPr>
+          <w:iCs/>
+          <w:i/>
+        </w:rPr>
+        <w:t xml:space="preserve">"I need as many sales as I can. What the fuck are you talking about?"</w:t>
+      </w:r>
+      <w:r>
+        <w:t xml:space="preserve"> </w:t>
+      </w:r>
+      <w:r>
+        <w:rPr>
+          <w:bCs/>
+          <w:b/>
+        </w:rPr>
+        <w:t xml:space="preserve">Fix:</w:t>
+      </w:r>
+      <w:r>
+        <w:t xml:space="preserve"> </w:t>
+      </w:r>
+      <w:r>
+        <w:t xml:space="preserve">choices 20/30/40/50, default 30, with the sourced note.</w:t>
+      </w:r>
+      <w:r>
+        <w:t xml:space="preserve"> </w:t>
+      </w:r>
+      <w:r>
+        <w:rPr>
+          <w:bCs/>
+          <w:b/>
+        </w:rPr>
+        <w:t xml:space="preserve">Rule:</w:t>
+      </w:r>
+      <w:r>
+        <w:t xml:space="preserve"> </w:t>
+      </w:r>
+      <w:r>
+        <w:t xml:space="preserve">any limit, cap or "safe number" that holds back his sales is looked up before it's built in, and the default leans toward selling more.</w:t>
       </w:r>
     </w:p>
     <w:p>

</xml_diff>

<commit_message>
Docs: shipping in User Guide, playbook T-74/T-75, journal
Co-Authored-By: Claude Opus 5.5 <noreply@anthropic.com>
Claude-Session: https://claude.ai/code/session_01JPZJaTbXQFN2qiYRf4rkZK
</commit_message>
<xml_diff>
--- a/docs/Next_Owner_Market_App_Builder_Playbook.docx
+++ b/docs/Next_Owner_Market_App_Builder_Playbook.docx
@@ -56760,6 +56760,114 @@
       </w:r>
       <w:r>
         <w:t xml:space="preserve">a number he gives is a ceiling or an example, never a new setting; change a setting only to the exact value he names, and say the new value back to him.</w:t>
+      </w:r>
+    </w:p>
+    <w:p>
+      <w:pPr>
+        <w:numPr>
+          <w:ilvl w:val="0"/>
+          <w:numId w:val="1064"/>
+        </w:numPr>
+        <w:pStyle w:val="Compact"/>
+      </w:pPr>
+      <w:r>
+        <w:rPr>
+          <w:bCs/>
+          <w:b/>
+        </w:rPr>
+        <w:t xml:space="preserve">T-74. AI-guessed weights were way off (Oct 25).</w:t>
+      </w:r>
+      <w:r>
+        <w:t xml:space="preserve"> </w:t>
+      </w:r>
+      <w:r>
+        <w:t xml:space="preserve">The importer let the AI guess every item's weight from photos: a filmstrip projector lot said 500 lb, a solid-state shortwave radio 9 lb. Fine for "freight vs box," useless for real shipping labels.</w:t>
+      </w:r>
+      <w:r>
+        <w:t xml:space="preserve"> </w:t>
+      </w:r>
+      <w:r>
+        <w:rPr>
+          <w:bCs/>
+          <w:b/>
+        </w:rPr>
+        <w:t xml:space="preserve">Fix:</w:t>
+      </w:r>
+      <w:r>
+        <w:t xml:space="preserve"> </w:t>
+      </w:r>
+      <w:r>
+        <w:t xml:space="preserve">looked up each shippable item's spec (maker spec, manual, eBay catalog), added packing (about 15% plus 1 lb, 2–3 in each side), saved the source link with it, and flagged what can't ship (compressed gas, chemical kits, over 70 lb).</w:t>
+      </w:r>
+      <w:r>
+        <w:t xml:space="preserve"> </w:t>
+      </w:r>
+      <w:r>
+        <w:rPr>
+          <w:bCs/>
+          <w:b/>
+        </w:rPr>
+        <w:t xml:space="preserve">Rule:</w:t>
+      </w:r>
+      <w:r>
+        <w:t xml:space="preserve"> </w:t>
+      </w:r>
+      <w:r>
+        <w:t xml:space="preserve">shipping weight comes from a spec page with the link saved, never from a photo guess; anything a label will be bought for gets a source.</w:t>
+      </w:r>
+    </w:p>
+    <w:p>
+      <w:pPr>
+        <w:numPr>
+          <w:ilvl w:val="0"/>
+          <w:numId w:val="1064"/>
+        </w:numPr>
+        <w:pStyle w:val="Compact"/>
+      </w:pPr>
+      <w:r>
+        <w:rPr>
+          <w:bCs/>
+          <w:b/>
+        </w:rPr>
+        <w:t xml:space="preserve">T-75. Web search can't see Facebook groups (Oct 25).</w:t>
+      </w:r>
+      <w:r>
+        <w:t xml:space="preserve"> </w:t>
+      </w:r>
+      <w:r>
+        <w:t xml:space="preserve">Groups are behind a login, so Google returns nothing usable for "Facebook group for X."</w:t>
+      </w:r>
+      <w:r>
+        <w:t xml:space="preserve"> </w:t>
+      </w:r>
+      <w:r>
+        <w:rPr>
+          <w:bCs/>
+          <w:b/>
+        </w:rPr>
+        <w:t xml:space="preserve">Fix:</w:t>
+      </w:r>
+      <w:r>
+        <w:t xml:space="preserve"> </w:t>
+      </w:r>
+      <w:r>
+        <w:t xml:space="preserve">the logged-in Claude in Chrome searches Facebook's own Groups search and writes the results to a file the app imports.</w:t>
+      </w:r>
+      <w:r>
+        <w:t xml:space="preserve"> </w:t>
+      </w:r>
+      <w:r>
+        <w:rPr>
+          <w:bCs/>
+          <w:b/>
+        </w:rPr>
+        <w:t xml:space="preserve">Rule:</w:t>
+      </w:r>
+      <w:r>
+        <w:t xml:space="preserve"> </w:t>
+      </w:r>
+      <w:r>
+        <w:t xml:space="preserve">for anything behind his logins, send the job to the browser that's signed in, not to web search.</w:t>
       </w:r>
     </w:p>
     <w:p>

</xml_diff>

<commit_message>
Docs: per-ad shipping choice, how Facebook prices shipping, T-76
Co-Authored-By: Claude Opus 5.5 <noreply@anthropic.com>
Claude-Session: https://claude.ai/code/session_01JPZJaTbXQFN2qiYRf4rkZK
</commit_message>
<xml_diff>
--- a/docs/Next_Owner_Market_App_Builder_Playbook.docx
+++ b/docs/Next_Owner_Market_App_Builder_Playbook.docx
@@ -56868,6 +56868,70 @@
       </w:r>
       <w:r>
         <w:t xml:space="preserve">for anything behind his logins, send the job to the browser that's signed in, not to web search.</w:t>
+      </w:r>
+    </w:p>
+    <w:p>
+      <w:pPr>
+        <w:numPr>
+          <w:ilvl w:val="0"/>
+          <w:numId w:val="1064"/>
+        </w:numPr>
+        <w:pStyle w:val="Compact"/>
+      </w:pPr>
+      <w:r>
+        <w:rPr>
+          <w:bCs/>
+          <w:b/>
+        </w:rPr>
+        <w:t xml:space="preserve">T-76. Built Facebook shipping without knowing how Facebook prices it (Oct 25–26).</w:t>
+      </w:r>
+      <w:r>
+        <w:t xml:space="preserve"> </w:t>
+      </w:r>
+      <w:r>
+        <w:t xml:space="preserve">Claude added "turn on shipping, weight X, or your own label at $Y" from blog posts. On his account there is no own-label option, Facebook asks only the weight, and charges one price set before any buyer exists; box size isn't asked, so a 62-inch carpet wand box (billed as 63 lb) sold with an 11 lb label.</w:t>
+      </w:r>
+      <w:r>
+        <w:t xml:space="preserve"> </w:t>
+      </w:r>
+      <w:r>
+        <w:rPr>
+          <w:iCs/>
+          <w:i/>
+        </w:rPr>
+        <w:t xml:space="preserve">"Evidently, you and the other app is not doing the proper research."</w:t>
+      </w:r>
+      <w:r>
+        <w:t xml:space="preserve"> </w:t>
+      </w:r>
+      <w:r>
+        <w:rPr>
+          <w:bCs/>
+          <w:b/>
+        </w:rPr>
+        <w:t xml:space="preserve">Fix:</w:t>
+      </w:r>
+      <w:r>
+        <w:t xml:space="preserve"> </w:t>
+      </w:r>
+      <w:r>
+        <w:t xml:space="preserve">per-ad choice (pickup / Facebook label / I ship it myself), a box-size check that warns when the post office would bill more than the weight, and pickup as the default until he picks.</w:t>
+      </w:r>
+      <w:r>
+        <w:t xml:space="preserve"> </w:t>
+      </w:r>
+      <w:r>
+        <w:rPr>
+          <w:bCs/>
+          <w:b/>
+        </w:rPr>
+        <w:t xml:space="preserve">Rule:</w:t>
+      </w:r>
+      <w:r>
+        <w:t xml:space="preserve"> </w:t>
+      </w:r>
+      <w:r>
+        <w:t xml:space="preserve">before automating anything on a platform, look at the real screen on his account (the signed-in browser) and the platform's terms; blog guides disagree and go stale.</w:t>
       </w:r>
     </w:p>
     <w:p>

</xml_diff>